<commit_message>
Rewrite hero: software engineer, 10 years, 4 open-source projects
Drops the wrong 'last four years owning the core client' claim and
describes the actual work areas, including the Python backend work.

Co-Authored-By: Claude Sonnet 5.5 <noreply@anthropic.com>
</commit_message>
<xml_diff>
--- a/resume/Tory-Hebert-Resume.docx
+++ b/resume/Tory-Hebert-Resume.docx
@@ -29,14 +29,14 @@
           <w:sz w:val="21"/>
           <w:szCs w:val="21"/>
         </w:rPr>
-        <w:t xml:space="preserve">Senior frontend engineer · Lafayette, LA (remote)</w:t>
+        <w:t xml:space="preserve">Software engineer · Frontend-first, growing full stack · Lafayette, LA (remote)</w:t>
       </w:r>
     </w:p>
     <w:p>
       <w:pPr>
         <w:spacing w:after="60"/>
       </w:pPr>
-      <w:hyperlink w:history="1" r:id="rId1nowrrtvwiwhtdnbf-4q7">
+      <w:hyperlink w:history="1" r:id="rIdei__kku3jrk2julr9k7ys">
         <w:r>
           <w:rPr>
             <w:rFonts w:ascii="Calibri" w:cs="Calibri" w:eastAsia="Calibri" w:hAnsi="Calibri"/>
@@ -53,7 +53,7 @@
         </w:rPr>
         <w:t xml:space="preserve">  ·  </w:t>
       </w:r>
-      <w:hyperlink w:history="1" r:id="rIddwn6mjahha6abvrlir4ky">
+      <w:hyperlink w:history="1" r:id="rIdfdr7sxq9273sjmmmdltsp">
         <w:r>
           <w:rPr>
             <w:rFonts w:ascii="Calibri" w:cs="Calibri" w:eastAsia="Calibri" w:hAnsi="Calibri"/>
@@ -70,7 +70,7 @@
         </w:rPr>
         <w:t xml:space="preserve">  ·  </w:t>
       </w:r>
-      <w:hyperlink w:history="1" r:id="rIdsa6ri3mthbkzasi3w8jky">
+      <w:hyperlink w:history="1" r:id="rIdrrvdnxilfockne-culmoi">
         <w:r>
           <w:rPr>
             <w:rFonts w:ascii="Calibri" w:cs="Calibri" w:eastAsia="Calibri" w:hAnsi="Calibri"/>
@@ -87,7 +87,7 @@
         </w:rPr>
         <w:t xml:space="preserve">  ·  </w:t>
       </w:r>
-      <w:hyperlink w:history="1" r:id="rIdcbriaghx6mwegur4swpua">
+      <w:hyperlink w:history="1" r:id="rId_j-yoazj8b-yrtoho27wl">
         <w:r>
           <w:rPr>
             <w:rFonts w:ascii="Calibri" w:cs="Calibri" w:eastAsia="Calibri" w:hAnsi="Calibri"/>
@@ -129,7 +129,7 @@
           <w:sz w:val="20"/>
           <w:szCs w:val="20"/>
         </w:rPr>
-        <w:t xml:space="preserve">Nine years building production React and TypeScript, the last four owning the core client of a K-5 reading platform that runs live student assessments. I get put on whatever the team needs next — assessment architecture, a Unity AR game, backend services — and I build my own AI agent tooling on the side. Selected open-source projects are listed below.</w:t>
+        <w:t xml:space="preserve">Ten years building production React and TypeScript. At Amira Learning I work across the reading platform used by 5.5M+ students: the educator app teachers use, the reading app that delivers tutor stories and assessments, the Angular app students land in, the internal tool CSMs use to configure districts and schools, and the parent portal. I started on the at-home apps and the Wonderscope AR game. Now I also write Python on the backend: the services that score assessments and assign them to students, and the pipeline that builds the assessment content. Hand me an unfamiliar project and I'll learn it and ship it, with AI agents in my workflow every day.</w:t>
       </w:r>
     </w:p>
     <w:p>
@@ -861,7 +861,7 @@
         </w:rPr>
         <w:t xml:space="preserve">  ·  </w:t>
       </w:r>
-      <w:hyperlink w:history="1" r:id="rIdruibyhsiobyadfkpfvtjo">
+      <w:hyperlink w:history="1" r:id="rIdokrdf8bvslhjfisyr1mog">
         <w:r>
           <w:rPr>
             <w:rFonts w:ascii="Calibri" w:cs="Calibri" w:eastAsia="Calibri" w:hAnsi="Calibri"/>
@@ -918,7 +918,7 @@
         </w:rPr>
         <w:t xml:space="preserve">  ·  </w:t>
       </w:r>
-      <w:hyperlink w:history="1" r:id="rIdrsjgdwnsuj5yp5wqbxng3">
+      <w:hyperlink w:history="1" r:id="rIdrgcishttrwfjksp5zru30">
         <w:r>
           <w:rPr>
             <w:rFonts w:ascii="Calibri" w:cs="Calibri" w:eastAsia="Calibri" w:hAnsi="Calibri"/>
@@ -975,7 +975,7 @@
         </w:rPr>
         <w:t xml:space="preserve">  ·  </w:t>
       </w:r>
-      <w:hyperlink w:history="1" r:id="rIdb1jdfpddjupzwgbusibbe">
+      <w:hyperlink w:history="1" r:id="rIdhoxaek1vfgct4gdm2aofb">
         <w:r>
           <w:rPr>
             <w:rFonts w:ascii="Calibri" w:cs="Calibri" w:eastAsia="Calibri" w:hAnsi="Calibri"/>
@@ -1032,7 +1032,7 @@
         </w:rPr>
         <w:t xml:space="preserve">  ·  </w:t>
       </w:r>
-      <w:hyperlink w:history="1" r:id="rIds-nio0enyetbnpzwfbcwv">
+      <w:hyperlink w:history="1" r:id="rIdp8qtsye8fdmpehkauqz12">
         <w:r>
           <w:rPr>
             <w:rFonts w:ascii="Calibri" w:cs="Calibri" w:eastAsia="Calibri" w:hAnsi="Calibri"/>
@@ -1203,10 +1203,6 @@
 </w:document>
 </file>
 
-<file path=word/comments.xml><?xml version="1.0" encoding="utf-8"?>
-<w:comments xmlns:cx="http://schemas.microsoft.com/office/drawing/2014/chartex" xmlns:cx1="http://schemas.microsoft.com/office/drawing/2015/9/8/chartex" xmlns:cx2="http://schemas.microsoft.com/office/drawing/2015/10/21/chartex" xmlns:cx3="http://schemas.microsoft.com/office/drawing/2016/5/9/chartex" xmlns:cx4="http://schemas.microsoft.com/office/drawing/2016/5/10/chartex" xmlns:cx5="http://schemas.microsoft.com/office/drawing/2016/5/11/chartex" xmlns:cx6="http://schemas.microsoft.com/office/drawing/2016/5/12/chartex" xmlns:cx7="http://schemas.microsoft.com/office/drawing/2016/5/13/chartex" xmlns:cx8="http://schemas.microsoft.com/office/drawing/2016/5/14/chartex" xmlns:mc="http://schemas.openxmlformats.org/markup-compatibility/2006" xmlns:aink="http://schemas.microsoft.com/office/drawing/2016/ink" xmlns:am3d="http://schemas.microsoft.com/office/drawing/2017/model3d" xmlns:o="urn:schemas-microsoft-com:office:office" xmlns:r="http://schemas.openxmlformats.org/officeDocument/2006/relationships" xmlns:m="http://schemas.openxmlformats.org/officeDocument/2006/math" xmlns:v="urn:schemas-microsoft-com:vml" xmlns:wp14="http://schemas.microsoft.com/office/word/2010/wordprocessingDrawing" xmlns:wp="http://schemas.openxmlformats.org/drawingml/2006/wordprocessingDrawing" xmlns:w10="urn:schemas-microsoft-com:office:word" xmlns:w="http://schemas.openxmlformats.org/wordprocessingml/2006/main" xmlns:w14="http://schemas.microsoft.com/office/word/2010/wordml" xmlns:w15="http://schemas.microsoft.com/office/word/2012/wordml" xmlns:w16cex="http://schemas.microsoft.com/office/word/2018/wordml/cex" xmlns:w16cid="http://schemas.microsoft.com/office/word/2016/wordml/cid" xmlns:w16="http://schemas.microsoft.com/office/word/2018/wordml" xmlns:w16sdtdh="http://schemas.microsoft.com/office/word/2020/wordml/sdtdatahash" xmlns:w16se="http://schemas.microsoft.com/office/word/2015/wordml/symex" xmlns:wpg="http://schemas.microsoft.com/office/word/2010/wordprocessingGroup" xmlns:wpi="http://schemas.microsoft.com/office/word/2010/wordprocessingInk" xmlns:wne="http://schemas.microsoft.com/office/word/2006/wordml" xmlns:wps="http://schemas.microsoft.com/office/word/2010/wordprocessingShape"/>
-</file>
-
 <file path=word/endnotes.xml><?xml version="1.0" encoding="utf-8"?>
 <w:endnotes xmlns:wpc="http://schemas.microsoft.com/office/word/2010/wordprocessingCanvas" xmlns:mc="http://schemas.openxmlformats.org/markup-compatibility/2006" xmlns:o="urn:schemas-microsoft-com:office:office" xmlns:r="http://schemas.openxmlformats.org/officeDocument/2006/relationships" xmlns:m="http://schemas.openxmlformats.org/officeDocument/2006/math" xmlns:v="urn:schemas-microsoft-com:vml" xmlns:wp14="http://schemas.microsoft.com/office/word/2010/wordprocessingDrawing" xmlns:wp="http://schemas.openxmlformats.org/drawingml/2006/wordprocessingDrawing" xmlns:w10="urn:schemas-microsoft-com:office:word" xmlns:w="http://schemas.openxmlformats.org/wordprocessingml/2006/main" xmlns:w14="http://schemas.microsoft.com/office/word/2010/wordml" xmlns:w15="http://schemas.microsoft.com/office/word/2012/wordml" xmlns:wpg="http://schemas.microsoft.com/office/word/2010/wordprocessingGroup" xmlns:wpi="http://schemas.microsoft.com/office/word/2010/wordprocessingInk" xmlns:wne="http://schemas.microsoft.com/office/word/2006/wordml" xmlns:wps="http://schemas.microsoft.com/office/word/2010/wordprocessingShape" mc:Ignorable="w14 w15 wp14">
   <w:endnote w:type="separator" w:id="-1">
@@ -1285,7 +1281,7 @@
 <w:numbering xmlns:wpc="http://schemas.microsoft.com/office/word/2010/wordprocessingCanvas" xmlns:mc="http://schemas.openxmlformats.org/markup-compatibility/2006" xmlns:o="urn:schemas-microsoft-com:office:office" xmlns:r="http://schemas.openxmlformats.org/officeDocument/2006/relationships" xmlns:m="http://schemas.openxmlformats.org/officeDocument/2006/math" xmlns:v="urn:schemas-microsoft-com:vml" xmlns:wp14="http://schemas.microsoft.com/office/word/2010/wordprocessingDrawing" xmlns:wp="http://schemas.openxmlformats.org/drawingml/2006/wordprocessingDrawing" xmlns:w10="urn:schemas-microsoft-com:office:word" xmlns:w="http://schemas.openxmlformats.org/wordprocessingml/2006/main" xmlns:w14="http://schemas.microsoft.com/office/word/2010/wordml" xmlns:w15="http://schemas.microsoft.com/office/word/2012/wordml" xmlns:wpg="http://schemas.microsoft.com/office/word/2010/wordprocessingGroup" xmlns:wpi="http://schemas.microsoft.com/office/word/2010/wordprocessingInk" xmlns:wne="http://schemas.microsoft.com/office/word/2006/wordml" xmlns:wps="http://schemas.microsoft.com/office/word/2010/wordprocessingShape" mc:Ignorable="w14 w15 wp14">
   <w:abstractNum w:abstractNumId="1" w15:restartNumberingAfterBreak="0">
     <w:multiLevelType w:val="hybridMultilevel"/>
-    <w:lvl w:ilvl="0" w15:tentative="1">
+    <w:lvl w:ilvl="0" w:tentative="1">
       <w:start w:val="1"/>
       <w:numFmt w:val="bullet"/>
       <w:lvlText w:val="●"/>
@@ -1294,7 +1290,7 @@
         <w:ind w:left="720" w:hanging="360"/>
       </w:pPr>
     </w:lvl>
-    <w:lvl w:ilvl="1" w15:tentative="1">
+    <w:lvl w:ilvl="1" w:tentative="1">
       <w:start w:val="1"/>
       <w:numFmt w:val="bullet"/>
       <w:lvlText w:val="○"/>
@@ -1303,7 +1299,7 @@
         <w:ind w:left="1440" w:hanging="360"/>
       </w:pPr>
     </w:lvl>
-    <w:lvl w:ilvl="2" w15:tentative="1">
+    <w:lvl w:ilvl="2" w:tentative="1">
       <w:start w:val="1"/>
       <w:numFmt w:val="bullet"/>
       <w:lvlText w:val="■"/>
@@ -1312,7 +1308,7 @@
         <w:ind w:left="2160" w:hanging="360"/>
       </w:pPr>
     </w:lvl>
-    <w:lvl w:ilvl="3" w15:tentative="1">
+    <w:lvl w:ilvl="3" w:tentative="1">
       <w:start w:val="1"/>
       <w:numFmt w:val="bullet"/>
       <w:lvlText w:val="●"/>
@@ -1321,7 +1317,7 @@
         <w:ind w:left="2880" w:hanging="360"/>
       </w:pPr>
     </w:lvl>
-    <w:lvl w:ilvl="4" w15:tentative="1">
+    <w:lvl w:ilvl="4" w:tentative="1">
       <w:start w:val="1"/>
       <w:numFmt w:val="bullet"/>
       <w:lvlText w:val="○"/>
@@ -1330,7 +1326,7 @@
         <w:ind w:left="3600" w:hanging="360"/>
       </w:pPr>
     </w:lvl>
-    <w:lvl w:ilvl="5" w15:tentative="1">
+    <w:lvl w:ilvl="5" w:tentative="1">
       <w:start w:val="1"/>
       <w:numFmt w:val="bullet"/>
       <w:lvlText w:val="■"/>
@@ -1339,7 +1335,7 @@
         <w:ind w:left="4320" w:hanging="360"/>
       </w:pPr>
     </w:lvl>
-    <w:lvl w:ilvl="6" w15:tentative="1">
+    <w:lvl w:ilvl="6" w:tentative="1">
       <w:start w:val="1"/>
       <w:numFmt w:val="bullet"/>
       <w:lvlText w:val="●"/>
@@ -1348,7 +1344,7 @@
         <w:ind w:left="5040" w:hanging="360"/>
       </w:pPr>
     </w:lvl>
-    <w:lvl w:ilvl="7" w15:tentative="1">
+    <w:lvl w:ilvl="7" w:tentative="1">
       <w:start w:val="1"/>
       <w:numFmt w:val="bullet"/>
       <w:lvlText w:val="●"/>
@@ -1357,7 +1353,7 @@
         <w:ind w:left="5760" w:hanging="360"/>
       </w:pPr>
     </w:lvl>
-    <w:lvl w:ilvl="8" w15:tentative="1">
+    <w:lvl w:ilvl="8" w:tentative="1">
       <w:start w:val="1"/>
       <w:numFmt w:val="bullet"/>
       <w:lvlText w:val="●"/>
@@ -1369,7 +1365,7 @@
   </w:abstractNum>
   <w:abstractNum w:abstractNumId="2" w15:restartNumberingAfterBreak="0">
     <w:multiLevelType w:val="hybridMultilevel"/>
-    <w:lvl w:ilvl="0" w15:tentative="1">
+    <w:lvl w:ilvl="0" w:tentative="1">
       <w:start w:val="1"/>
       <w:numFmt w:val="bullet"/>
       <w:lvlText w:val="•"/>
@@ -1407,6 +1403,10 @@
     </w:rPrDefault>
     <w:pPrDefault/>
   </w:docDefaults>
+  <w:style w:type="paragraph" w:styleId="Normal" w:default="1">
+    <w:name w:val="Normal"/>
+    <w:qFormat/>
+  </w:style>
   <w:style w:type="paragraph" w:styleId="Title">
     <w:name w:val="Title"/>
     <w:basedOn w:val="Normal"/>
@@ -1579,4 +1579,294 @@
     </w:rPr>
   </w:style>
 </w:styles>
+</file>
+
+<file path=word/theme/theme1.xml><?xml version="1.0" encoding="utf-8"?>
+<a:theme xmlns:a="http://schemas.openxmlformats.org/drawingml/2006/main" name="Office Theme">
+  <a:themeElements>
+    <a:clrScheme name="Office">
+      <a:dk1>
+        <a:sysClr val="windowText" lastClr="000000"/>
+      </a:dk1>
+      <a:lt1>
+        <a:sysClr val="window" lastClr="FFFFFF"/>
+      </a:lt1>
+      <a:dk2>
+        <a:srgbClr val="44546A"/>
+      </a:dk2>
+      <a:lt2>
+        <a:srgbClr val="E7E6E6"/>
+      </a:lt2>
+      <a:accent1>
+        <a:srgbClr val="4472C4"/>
+      </a:accent1>
+      <a:accent2>
+        <a:srgbClr val="ED7D31"/>
+      </a:accent2>
+      <a:accent3>
+        <a:srgbClr val="A5A5A5"/>
+      </a:accent3>
+      <a:accent4>
+        <a:srgbClr val="FFC000"/>
+      </a:accent4>
+      <a:accent5>
+        <a:srgbClr val="5B9BD5"/>
+      </a:accent5>
+      <a:accent6>
+        <a:srgbClr val="70AD47"/>
+      </a:accent6>
+      <a:hlink>
+        <a:srgbClr val="0563C1"/>
+      </a:hlink>
+      <a:folHlink>
+        <a:srgbClr val="954F72"/>
+      </a:folHlink>
+    </a:clrScheme>
+    <a:fontScheme name="Office">
+      <a:majorFont>
+        <a:latin typeface="Calibri Light" panose="020F0302020204030204"/>
+        <a:ea typeface=""/>
+        <a:cs typeface=""/>
+        <a:font script="Jpan" typeface="游ゴシック Light"/>
+        <a:font script="Hang" typeface="맑은 고딕"/>
+        <a:font script="Hans" typeface="等线 Light"/>
+        <a:font script="Hant" typeface="新細明體"/>
+        <a:font script="Arab" typeface="Times New Roman"/>
+        <a:font script="Hebr" typeface="Times New Roman"/>
+        <a:font script="Thai" typeface="Angsana New"/>
+        <a:font script="Ethi" typeface="Nyala"/>
+        <a:font script="Beng" typeface="Vrinda"/>
+        <a:font script="Gujr" typeface="Shruti"/>
+        <a:font script="Khmr" typeface="MoolBoran"/>
+        <a:font script="Knda" typeface="Tunga"/>
+        <a:font script="Guru" typeface="Raavi"/>
+        <a:font script="Cans" typeface="Euphemia"/>
+        <a:font script="Cher" typeface="Plantagenet Cherokee"/>
+        <a:font script="Yiii" typeface="Microsoft Yi Baiti"/>
+        <a:font script="Tibt" typeface="Microsoft Himalaya"/>
+        <a:font script="Thaa" typeface="MV Boli"/>
+        <a:font script="Deva" typeface="Mangal"/>
+        <a:font script="Telu" typeface="Gautami"/>
+        <a:font script="Taml" typeface="Latha"/>
+        <a:font script="Syrc" typeface="Estrangelo Edessa"/>
+        <a:font script="Orya" typeface="Kalinga"/>
+        <a:font script="Mlym" typeface="Kartika"/>
+        <a:font script="Laoo" typeface="DokChampa"/>
+        <a:font script="Sinh" typeface="Iskoola Pota"/>
+        <a:font script="Mong" typeface="Mongolian Baiti"/>
+        <a:font script="Viet" typeface="Times New Roman"/>
+        <a:font script="Uigh" typeface="Microsoft Uighur"/>
+        <a:font script="Geor" typeface="Sylfaen"/>
+        <a:font script="Armn" typeface="Arial"/>
+        <a:font script="Bugi" typeface="Leelawadee UI"/>
+        <a:font script="Bopo" typeface="Microsoft JhengHei"/>
+        <a:font script="Java" typeface="Javanese Text"/>
+        <a:font script="Lisu" typeface="Segoe UI"/>
+        <a:font script="Mymr" typeface="Myanmar Text"/>
+        <a:font script="Nkoo" typeface="Ebrima"/>
+        <a:font script="Olck" typeface="Nirmala UI"/>
+        <a:font script="Osma" typeface="Ebrima"/>
+        <a:font script="Phag" typeface="Phagspa"/>
+        <a:font script="Syrn" typeface="Estrangelo Edessa"/>
+        <a:font script="Syrj" typeface="Estrangelo Edessa"/>
+        <a:font script="Syre" typeface="Estrangelo Edessa"/>
+        <a:font script="Sora" typeface="Nirmala UI"/>
+        <a:font script="Tale" typeface="Microsoft Tai Le"/>
+        <a:font script="Talu" typeface="Microsoft New Tai Lue"/>
+        <a:font script="Tfng" typeface="Ebrima"/>
+      </a:majorFont>
+      <a:minorFont>
+        <a:latin typeface="Calibri" panose="020F0502020204030204"/>
+        <a:ea typeface=""/>
+        <a:cs typeface=""/>
+        <a:font script="Jpan" typeface="游明朝"/>
+        <a:font script="Hang" typeface="맑은 고딕"/>
+        <a:font script="Hans" typeface="等线"/>
+        <a:font script="Hant" typeface="新細明體"/>
+        <a:font script="Arab" typeface="Arial"/>
+        <a:font script="Hebr" typeface="Arial"/>
+        <a:font script="Thai" typeface="Cordia New"/>
+        <a:font script="Ethi" typeface="Nyala"/>
+        <a:font script="Beng" typeface="Vrinda"/>
+        <a:font script="Gujr" typeface="Shruti"/>
+        <a:font script="Khmr" typeface="DaunPenh"/>
+        <a:font script="Knda" typeface="Tunga"/>
+        <a:font script="Guru" typeface="Raavi"/>
+        <a:font script="Cans" typeface="Euphemia"/>
+        <a:font script="Cher" typeface="Plantagenet Cherokee"/>
+        <a:font script="Yiii" typeface="Microsoft Yi Baiti"/>
+        <a:font script="Tibt" typeface="Microsoft Himalaya"/>
+        <a:font script="Thaa" typeface="MV Boli"/>
+        <a:font script="Deva" typeface="Mangal"/>
+        <a:font script="Telu" typeface="Gautami"/>
+        <a:font script="Taml" typeface="Latha"/>
+        <a:font script="Syrc" typeface="Estrangelo Edessa"/>
+        <a:font script="Orya" typeface="Kalinga"/>
+        <a:font script="Mlym" typeface="Kartika"/>
+        <a:font script="Laoo" typeface="DokChampa"/>
+        <a:font script="Sinh" typeface="Iskoola Pota"/>
+        <a:font script="Mong" typeface="Mongolian Baiti"/>
+        <a:font script="Viet" typeface="Arial"/>
+        <a:font script="Uigh" typeface="Microsoft Uighur"/>
+        <a:font script="Geor" typeface="Sylfaen"/>
+        <a:font script="Armn" typeface="Arial"/>
+        <a:font script="Bugi" typeface="Leelawadee UI"/>
+        <a:font script="Bopo" typeface="Microsoft JhengHei"/>
+        <a:font script="Java" typeface="Javanese Text"/>
+        <a:font script="Lisu" typeface="Segoe UI"/>
+        <a:font script="Mymr" typeface="Myanmar Text"/>
+        <a:font script="Nkoo" typeface="Ebrima"/>
+        <a:font script="Olck" typeface="Nirmala UI"/>
+        <a:font script="Osma" typeface="Ebrima"/>
+        <a:font script="Phag" typeface="Phagspa"/>
+        <a:font script="Syrn" typeface="Estrangelo Edessa"/>
+        <a:font script="Syrj" typeface="Estrangelo Edessa"/>
+        <a:font script="Syre" typeface="Estrangelo Edessa"/>
+        <a:font script="Sora" typeface="Nirmala UI"/>
+        <a:font script="Tale" typeface="Microsoft Tai Le"/>
+        <a:font script="Talu" typeface="Microsoft New Tai Lue"/>
+        <a:font script="Tfng" typeface="Ebrima"/>
+      </a:minorFont>
+    </a:fontScheme>
+    <a:fmtScheme name="Office">
+      <a:fillStyleLst>
+        <a:solidFill>
+          <a:schemeClr val="phClr"/>
+        </a:solidFill>
+        <a:gradFill rotWithShape="true">
+          <a:gsLst>
+            <a:gs pos="0">
+              <a:schemeClr val="phClr">
+                <a:lumMod val="110000"/>
+                <a:satMod val="105000"/>
+                <a:tint val="67000"/>
+              </a:schemeClr>
+            </a:gs>
+            <a:gs pos="50000">
+              <a:schemeClr val="phClr">
+                <a:lumMod val="105000"/>
+                <a:satMod val="103000"/>
+                <a:tint val="73000"/>
+              </a:schemeClr>
+            </a:gs>
+            <a:gs pos="100000">
+              <a:schemeClr val="phClr">
+                <a:lumMod val="105000"/>
+                <a:satMod val="109000"/>
+                <a:tint val="81000"/>
+              </a:schemeClr>
+            </a:gs>
+          </a:gsLst>
+          <a:lin ang="5400000" scaled="false"/>
+        </a:gradFill>
+        <a:gradFill rotWithShape="true">
+          <a:gsLst>
+            <a:gs pos="0">
+              <a:schemeClr val="phClr">
+                <a:satMod val="103000"/>
+                <a:lumMod val="102000"/>
+                <a:tint val="94000"/>
+              </a:schemeClr>
+            </a:gs>
+            <a:gs pos="50000">
+              <a:schemeClr val="phClr">
+                <a:satMod val="110000"/>
+                <a:lumMod val="100000"/>
+                <a:shade val="100000"/>
+              </a:schemeClr>
+            </a:gs>
+            <a:gs pos="100000">
+              <a:schemeClr val="phClr">
+                <a:lumMod val="99000"/>
+                <a:satMod val="120000"/>
+                <a:shade val="78000"/>
+              </a:schemeClr>
+            </a:gs>
+          </a:gsLst>
+          <a:lin ang="5400000" scaled="false"/>
+        </a:gradFill>
+      </a:fillStyleLst>
+      <a:lnStyleLst>
+        <a:ln w="6350" cap="flat" cmpd="sng" algn="ctr">
+          <a:solidFill>
+            <a:schemeClr val="phClr"/>
+          </a:solidFill>
+          <a:prstDash val="solid"/>
+          <a:miter lim="800000"/>
+        </a:ln>
+        <a:ln w="12700" cap="flat" cmpd="sng" algn="ctr">
+          <a:solidFill>
+            <a:schemeClr val="phClr"/>
+          </a:solidFill>
+          <a:prstDash val="solid"/>
+          <a:miter lim="800000"/>
+        </a:ln>
+        <a:ln w="19050" cap="flat" cmpd="sng" algn="ctr">
+          <a:solidFill>
+            <a:schemeClr val="phClr"/>
+          </a:solidFill>
+          <a:prstDash val="solid"/>
+          <a:miter lim="800000"/>
+        </a:ln>
+      </a:lnStyleLst>
+      <a:effectStyleLst>
+        <a:effectStyle>
+          <a:effectLst/>
+        </a:effectStyle>
+        <a:effectStyle>
+          <a:effectLst/>
+        </a:effectStyle>
+        <a:effectStyle>
+          <a:effectLst>
+            <a:outerShdw blurRad="57150" dist="19050" dir="5400000" algn="ctr" rotWithShape="false">
+              <a:srgbClr val="000000">
+                <a:alpha val="63000"/>
+              </a:srgbClr>
+            </a:outerShdw>
+          </a:effectLst>
+        </a:effectStyle>
+      </a:effectStyleLst>
+      <a:bgFillStyleLst>
+        <a:solidFill>
+          <a:schemeClr val="phClr"/>
+        </a:solidFill>
+        <a:solidFill>
+          <a:schemeClr val="phClr">
+            <a:tint val="95000"/>
+            <a:satMod val="170000"/>
+          </a:schemeClr>
+        </a:solidFill>
+        <a:gradFill rotWithShape="true">
+          <a:gsLst>
+            <a:gs pos="0">
+              <a:schemeClr val="phClr">
+                <a:tint val="93000"/>
+                <a:satMod val="150000"/>
+                <a:shade val="98000"/>
+                <a:lumMod val="102000"/>
+              </a:schemeClr>
+            </a:gs>
+            <a:gs pos="50000">
+              <a:schemeClr val="phClr">
+                <a:tint val="98000"/>
+                <a:satMod val="130000"/>
+                <a:shade val="90000"/>
+                <a:lumMod val="103000"/>
+              </a:schemeClr>
+            </a:gs>
+            <a:gs pos="100000">
+              <a:schemeClr val="phClr">
+                <a:shade val="63000"/>
+                <a:satMod val="120000"/>
+              </a:schemeClr>
+            </a:gs>
+          </a:gsLst>
+          <a:lin ang="5400000" scaled="false"/>
+        </a:gradFill>
+      </a:bgFillStyleLst>
+    </a:fmtScheme>
+  </a:themeElements>
+  <a:objectDefaults/>
+  <a:extraClrSchemeLst/>
+</a:theme>
 </file>
</xml_diff>

<commit_message>
Rewrite Amira role and hero: AI-native, work areas, cross-functional work
Removes a private mention, release/commit counts and the
white-label phrasing. Adds the Assessment Preview Tool and who I work with.

Co-Authored-By: Claude Sonnet 5.5 <noreply@anthropic.com>
</commit_message>
<xml_diff>
--- a/resume/Tory-Hebert-Resume.docx
+++ b/resume/Tory-Hebert-Resume.docx
@@ -29,14 +29,14 @@
           <w:sz w:val="21"/>
           <w:szCs w:val="21"/>
         </w:rPr>
-        <w:t xml:space="preserve">Software engineer · Frontend-first, growing full stack · Lafayette, LA (remote)</w:t>
+        <w:t xml:space="preserve">Software engineer · AI-native · Frontend-first, growing full stack · Lafayette, LA (remote)</w:t>
       </w:r>
     </w:p>
     <w:p>
       <w:pPr>
         <w:spacing w:after="60"/>
       </w:pPr>
-      <w:hyperlink w:history="1" r:id="rIdei__kku3jrk2julr9k7ys">
+      <w:hyperlink w:history="1" r:id="rIdqmh_cjidjvisfrmgtxmd5">
         <w:r>
           <w:rPr>
             <w:rFonts w:ascii="Calibri" w:cs="Calibri" w:eastAsia="Calibri" w:hAnsi="Calibri"/>
@@ -53,7 +53,7 @@
         </w:rPr>
         <w:t xml:space="preserve">  ·  </w:t>
       </w:r>
-      <w:hyperlink w:history="1" r:id="rIdfdr7sxq9273sjmmmdltsp">
+      <w:hyperlink w:history="1" r:id="rIdxpqkf9ddw7bz4hcs2gn1q">
         <w:r>
           <w:rPr>
             <w:rFonts w:ascii="Calibri" w:cs="Calibri" w:eastAsia="Calibri" w:hAnsi="Calibri"/>
@@ -70,7 +70,7 @@
         </w:rPr>
         <w:t xml:space="preserve">  ·  </w:t>
       </w:r>
-      <w:hyperlink w:history="1" r:id="rIdrrvdnxilfockne-culmoi">
+      <w:hyperlink w:history="1" r:id="rId0gndk-j3de-9utbvxqpoc">
         <w:r>
           <w:rPr>
             <w:rFonts w:ascii="Calibri" w:cs="Calibri" w:eastAsia="Calibri" w:hAnsi="Calibri"/>
@@ -87,7 +87,7 @@
         </w:rPr>
         <w:t xml:space="preserve">  ·  </w:t>
       </w:r>
-      <w:hyperlink w:history="1" r:id="rId_j-yoazj8b-yrtoho27wl">
+      <w:hyperlink w:history="1" r:id="rIdvn7knqd-_nmnci_ru_hl5">
         <w:r>
           <w:rPr>
             <w:rFonts w:ascii="Calibri" w:cs="Calibri" w:eastAsia="Calibri" w:hAnsi="Calibri"/>
@@ -129,7 +129,7 @@
           <w:sz w:val="20"/>
           <w:szCs w:val="20"/>
         </w:rPr>
-        <w:t xml:space="preserve">Ten years building production React and TypeScript. At Amira Learning I work across the reading platform used by 5.5M+ students: the educator app teachers use, the reading app that delivers tutor stories and assessments, the Angular app students land in, the internal tool CSMs use to configure districts and schools, and the parent portal. I started on the at-home apps and the Wonderscope AR game. Now I also write Python on the backend: the services that score assessments and assign them to students, and the pipeline that builds the assessment content. Hand me an unfamiliar project and I'll learn it and ship it, with AI agents in my workflow every day.</w:t>
+        <w:t xml:space="preserve">AI-native software engineer with ten years building production React and TypeScript. Agents are part of how I plan, build, test and debug every day, and I build my own agent tooling, open source below. At Amira Learning I work across the reading platform used by 5.5M+ students: the educator app, the reading app that delivers tutor stories and assessments, the Angular app students land in, the internal tool CSMs use to configure districts and schools, and the parent portal. I started on the at-home apps and the Wonderscope AR game. Now I also write Python on the backend, on the services that score and assign assessments and the pipeline that builds assessment content. Hand me an unfamiliar project and I'll learn it and ship it. I work directly with product, QA, UX designers, learning designers and psychometricians, not just other engineers.</w:t>
       </w:r>
     </w:p>
     <w:p>
@@ -210,119 +210,216 @@
           <w:sz w:val="20"/>
           <w:szCs w:val="20"/>
         </w:rPr>
-        <w:t xml:space="preserve">Own the core K-5 student reading and assessment client</w:t>
-      </w:r>
-    </w:p>
-    <w:p>
-      <w:pPr>
-        <w:keepNext/>
-        <w:spacing w:after="30"/>
-      </w:pPr>
-      <w:r>
-        <w:rPr>
-          <w:rFonts w:ascii="Calibri" w:cs="Calibri" w:eastAsia="Calibri" w:hAnsi="Calibri"/>
-          <w:i/>
-          <w:iCs/>
-          <w:color w:val="5A554C"/>
-          <w:sz w:val="19"/>
-          <w:szCs w:val="19"/>
-        </w:rPr>
-        <w:t xml:space="preserve">5.5M+ students, 4,000+ districts nationwide</w:t>
-      </w:r>
-    </w:p>
-    <w:p>
-      <w:pPr>
-        <w:pStyle w:val="ListParagraph"/>
-        <w:numPr>
-          <w:ilvl w:val="0"/>
-          <w:numId w:val="2"/>
-        </w:numPr>
-        <w:spacing w:after="30"/>
-      </w:pPr>
-      <w:r>
-        <w:rPr>
-          <w:rFonts w:ascii="Calibri" w:cs="Calibri" w:eastAsia="Calibri" w:hAnsi="Calibri"/>
-          <w:color w:val="1A1712"/>
-          <w:sz w:val="20"/>
-          <w:szCs w:val="20"/>
-        </w:rPr>
-        <w:t xml:space="preserve">Migrated the real-time assessment engine from a client-authoritative to a server-orchestrated architecture, now serving all English-language assessments in production.</w:t>
-      </w:r>
-    </w:p>
-    <w:p>
-      <w:pPr>
-        <w:pStyle w:val="ListParagraph"/>
-        <w:numPr>
-          <w:ilvl w:val="0"/>
-          <w:numId w:val="2"/>
-        </w:numPr>
-        <w:spacing w:after="30"/>
-      </w:pPr>
-      <w:r>
-        <w:rPr>
-          <w:rFonts w:ascii="Calibri" w:cs="Calibri" w:eastAsia="Calibri" w:hAnsi="Calibri"/>
-          <w:color w:val="1A1712"/>
-          <w:sz w:val="20"/>
-          <w:szCs w:val="20"/>
-        </w:rPr>
-        <w:t xml:space="preserve">Shipped an LLM-powered conversational comprehension feature end to end, a WebGL-rendered animated tutor avatar system, and a 6-brand white-label platform serving enterprise partners including NWEA and HMH.</w:t>
-      </w:r>
-    </w:p>
-    <w:p>
-      <w:pPr>
-        <w:pStyle w:val="ListParagraph"/>
-        <w:numPr>
-          <w:ilvl w:val="0"/>
-          <w:numId w:val="2"/>
-        </w:numPr>
-        <w:spacing w:after="30"/>
-      </w:pPr>
-      <w:r>
-        <w:rPr>
-          <w:rFonts w:ascii="Calibri" w:cs="Calibri" w:eastAsia="Calibri" w:hAnsi="Calibri"/>
-          <w:color w:val="1A1712"/>
-          <w:sz w:val="20"/>
-          <w:szCs w:val="20"/>
-        </w:rPr>
-        <w:t xml:space="preserve">Led frontend development on the teacher/admin app for 16 months: bilingual (Spanish) assessment configuration, screening-window scheduling, and a client-side Word-document generator for intervention plans.</w:t>
-      </w:r>
-    </w:p>
-    <w:p>
-      <w:pPr>
-        <w:pStyle w:val="ListParagraph"/>
-        <w:numPr>
-          <w:ilvl w:val="0"/>
-          <w:numId w:val="2"/>
-        </w:numPr>
-        <w:spacing w:after="30"/>
-      </w:pPr>
-      <w:r>
-        <w:rPr>
-          <w:rFonts w:ascii="Calibri" w:cs="Calibri" w:eastAsia="Calibri" w:hAnsi="Calibri"/>
-          <w:color w:val="1A1712"/>
-          <w:sz w:val="20"/>
-          <w:szCs w:val="20"/>
-        </w:rPr>
-        <w:t xml:space="preserve">Built and maintained a parent portal and a district license-configuration grid, replacing per-stack feature flags with per-district license entitlement checks.</w:t>
-      </w:r>
-    </w:p>
-    <w:p>
-      <w:pPr>
-        <w:pStyle w:val="ListParagraph"/>
-        <w:numPr>
-          <w:ilvl w:val="0"/>
-          <w:numId w:val="2"/>
-        </w:numPr>
-        <w:spacing w:after="30"/>
-      </w:pPr>
-      <w:r>
-        <w:rPr>
-          <w:rFonts w:ascii="Calibri" w:cs="Calibri" w:eastAsia="Calibri" w:hAnsi="Calibri"/>
-          <w:color w:val="1A1712"/>
-          <w:sz w:val="20"/>
-          <w:szCs w:val="20"/>
-        </w:rPr>
-        <w:t xml:space="preserve">Delivered cross-platform frontend work during the Amira/Istation platform merger.</w:t>
+        <w:t xml:space="preserve">Assessments and reading products across every client</w:t>
+      </w:r>
+    </w:p>
+    <w:p>
+      <w:pPr>
+        <w:pStyle w:val="ListParagraph"/>
+        <w:numPr>
+          <w:ilvl w:val="0"/>
+          <w:numId w:val="2"/>
+        </w:numPr>
+        <w:spacing w:after="30"/>
+      </w:pPr>
+      <w:r>
+        <w:rPr>
+          <w:rFonts w:ascii="Calibri" w:cs="Calibri" w:eastAsia="Calibri" w:hAnsi="Calibri"/>
+          <w:color w:val="1A1712"/>
+          <w:sz w:val="20"/>
+          <w:szCs w:val="20"/>
+        </w:rPr>
+        <w:t xml:space="preserve">Own assessment features across the educator app, the reading app and the Angular student app, on a platform serving 5.5M+ students.</w:t>
+      </w:r>
+    </w:p>
+    <w:p>
+      <w:pPr>
+        <w:pStyle w:val="ListParagraph"/>
+        <w:numPr>
+          <w:ilvl w:val="0"/>
+          <w:numId w:val="2"/>
+        </w:numPr>
+        <w:spacing w:after="30"/>
+      </w:pPr>
+      <w:r>
+        <w:rPr>
+          <w:rFonts w:ascii="Calibri" w:cs="Calibri" w:eastAsia="Calibri" w:hAnsi="Calibri"/>
+          <w:color w:val="1A1712"/>
+          <w:sz w:val="20"/>
+          <w:szCs w:val="20"/>
+        </w:rPr>
+        <w:t xml:space="preserve">Educator app: the teacher-facing tools, including Spanish assessment configuration, screening-window scheduling, and a Word-document generator for intervention plans.</w:t>
+      </w:r>
+    </w:p>
+    <w:p>
+      <w:pPr>
+        <w:pStyle w:val="ListParagraph"/>
+        <w:numPr>
+          <w:ilvl w:val="0"/>
+          <w:numId w:val="2"/>
+        </w:numPr>
+        <w:spacing w:after="30"/>
+      </w:pPr>
+      <w:r>
+        <w:rPr>
+          <w:rFonts w:ascii="Calibri" w:cs="Calibri" w:eastAsia="Calibri" w:hAnsi="Calibri"/>
+          <w:color w:val="1A1712"/>
+          <w:sz w:val="20"/>
+          <w:szCs w:val="20"/>
+        </w:rPr>
+        <w:t xml:space="preserve">Reading app: delivers tutor stories and assessments to students.</w:t>
+      </w:r>
+    </w:p>
+    <w:p>
+      <w:pPr>
+        <w:pStyle w:val="ListParagraph"/>
+        <w:numPr>
+          <w:ilvl w:val="0"/>
+          <w:numId w:val="2"/>
+        </w:numPr>
+        <w:spacing w:after="30"/>
+      </w:pPr>
+      <w:r>
+        <w:rPr>
+          <w:rFonts w:ascii="Calibri" w:cs="Calibri" w:eastAsia="Calibri" w:hAnsi="Calibri"/>
+          <w:color w:val="1A1712"/>
+          <w:sz w:val="20"/>
+          <w:szCs w:val="20"/>
+        </w:rPr>
+        <w:t xml:space="preserve">Angular student app: where students land at login. It fetches their assignments, decides when to administer them, and routes them to the reading app.</w:t>
+      </w:r>
+    </w:p>
+    <w:p>
+      <w:pPr>
+        <w:pStyle w:val="ListParagraph"/>
+        <w:numPr>
+          <w:ilvl w:val="0"/>
+          <w:numId w:val="2"/>
+        </w:numPr>
+        <w:spacing w:after="30"/>
+      </w:pPr>
+      <w:r>
+        <w:rPr>
+          <w:rFonts w:ascii="Calibri" w:cs="Calibri" w:eastAsia="Calibri" w:hAnsi="Calibri"/>
+          <w:color w:val="1A1712"/>
+          <w:sz w:val="20"/>
+          <w:szCs w:val="20"/>
+        </w:rPr>
+        <w:t xml:space="preserve">Internal config tool: the CSM-facing tool that sets licenses and settings across districts and schools. It replaced per-stack feature flags with per-district license checks.</w:t>
+      </w:r>
+    </w:p>
+    <w:p>
+      <w:pPr>
+        <w:pStyle w:val="ListParagraph"/>
+        <w:numPr>
+          <w:ilvl w:val="0"/>
+          <w:numId w:val="2"/>
+        </w:numPr>
+        <w:spacing w:after="30"/>
+      </w:pPr>
+      <w:r>
+        <w:rPr>
+          <w:rFonts w:ascii="Calibri" w:cs="Calibri" w:eastAsia="Calibri" w:hAnsi="Calibri"/>
+          <w:color w:val="1A1712"/>
+          <w:sz w:val="20"/>
+          <w:szCs w:val="20"/>
+        </w:rPr>
+        <w:t xml:space="preserve">Parent portal: a summary app with each student's latest information and suggested activities.</w:t>
+      </w:r>
+    </w:p>
+    <w:p>
+      <w:pPr>
+        <w:pStyle w:val="ListParagraph"/>
+        <w:numPr>
+          <w:ilvl w:val="0"/>
+          <w:numId w:val="2"/>
+        </w:numPr>
+        <w:spacing w:after="30"/>
+      </w:pPr>
+      <w:r>
+        <w:rPr>
+          <w:rFonts w:ascii="Calibri" w:cs="Calibri" w:eastAsia="Calibri" w:hAnsi="Calibri"/>
+          <w:color w:val="1A1712"/>
+          <w:sz w:val="20"/>
+          <w:szCs w:val="20"/>
+        </w:rPr>
+        <w:t xml:space="preserve">Backend in Python: assessment scoring and orchestration, the assignment service, and the content build pipeline for a new assessment offering.</w:t>
+      </w:r>
+    </w:p>
+    <w:p>
+      <w:pPr>
+        <w:pStyle w:val="ListParagraph"/>
+        <w:numPr>
+          <w:ilvl w:val="0"/>
+          <w:numId w:val="2"/>
+        </w:numPr>
+        <w:spacing w:after="30"/>
+      </w:pPr>
+      <w:r>
+        <w:rPr>
+          <w:rFonts w:ascii="Calibri" w:cs="Calibri" w:eastAsia="Calibri" w:hAnsi="Calibri"/>
+          <w:color w:val="1A1712"/>
+          <w:sz w:val="20"/>
+          <w:szCs w:val="20"/>
+        </w:rPr>
+        <w:t xml:space="preserve">Work directly and daily with QA and product managers. Work regularly with UX designers and learning designers, and weekly with psychometricians on assessment work. I turn their specs and workflows into shipped features and into tools they can use without an engineer.</w:t>
+      </w:r>
+    </w:p>
+    <w:p>
+      <w:pPr>
+        <w:pStyle w:val="ListParagraph"/>
+        <w:numPr>
+          <w:ilvl w:val="0"/>
+          <w:numId w:val="2"/>
+        </w:numPr>
+        <w:spacing w:after="30"/>
+      </w:pPr>
+      <w:r>
+        <w:rPr>
+          <w:rFonts w:ascii="Calibri" w:cs="Calibri" w:eastAsia="Calibri" w:hAnsi="Calibri"/>
+          <w:color w:val="1A1712"/>
+          <w:sz w:val="20"/>
+          <w:szCs w:val="20"/>
+        </w:rPr>
+        <w:t xml:space="preserve">Built lexa-preview, a tool that plays any assessment item directly in the reading client. Learning designers and client developers no longer have to assign a full assessment and sit through the multi-minute flow to preview one item, even when the item doesn't exist in that environment yet.</w:t>
+      </w:r>
+    </w:p>
+    <w:p>
+      <w:pPr>
+        <w:pStyle w:val="ListParagraph"/>
+        <w:numPr>
+          <w:ilvl w:val="0"/>
+          <w:numId w:val="2"/>
+        </w:numPr>
+        <w:spacing w:after="30"/>
+      </w:pPr>
+      <w:r>
+        <w:rPr>
+          <w:rFonts w:ascii="Calibri" w:cs="Calibri" w:eastAsia="Calibri" w:hAnsi="Calibri"/>
+          <w:color w:val="1A1712"/>
+          <w:sz w:val="20"/>
+          <w:szCs w:val="20"/>
+        </w:rPr>
+        <w:t xml:space="preserve">Wonderscope: led the team on an acquired AR reading game that integrates Amira's tutor. I was the only one with Unity/C# experience at the start, and I taught it to the rest of the team. Worked daily with a game designer, 3D modelers and animators.</w:t>
+      </w:r>
+    </w:p>
+    <w:p>
+      <w:pPr>
+        <w:pStyle w:val="ListParagraph"/>
+        <w:numPr>
+          <w:ilvl w:val="0"/>
+          <w:numId w:val="2"/>
+        </w:numPr>
+        <w:spacing w:after="30"/>
+      </w:pPr>
+      <w:r>
+        <w:rPr>
+          <w:rFonts w:ascii="Calibri" w:cs="Calibri" w:eastAsia="Calibri" w:hAnsi="Calibri"/>
+          <w:color w:val="1A1712"/>
+          <w:sz w:val="20"/>
+          <w:szCs w:val="20"/>
+        </w:rPr>
+        <w:t xml:space="preserve">Built an After Effects scripting pipeline that generated hundreds of letter-teaching videos.</w:t>
       </w:r>
     </w:p>
     <w:p>
@@ -339,80 +436,6 @@
           <w:sz w:val="20"/>
           <w:szCs w:val="20"/>
         </w:rPr>
-        <w:t xml:space="preserve">Took lead on the team's AR/Unity and non-web projects</w:t>
-      </w:r>
-    </w:p>
-    <w:p>
-      <w:pPr>
-        <w:pStyle w:val="ListParagraph"/>
-        <w:numPr>
-          <w:ilvl w:val="0"/>
-          <w:numId w:val="2"/>
-        </w:numPr>
-        <w:spacing w:after="30"/>
-      </w:pPr>
-      <w:r>
-        <w:rPr>
-          <w:rFonts w:ascii="Calibri" w:cs="Calibri" w:eastAsia="Calibri" w:hAnsi="Calibri"/>
-          <w:color w:val="1A1712"/>
-          <w:sz w:val="20"/>
-          <w:szCs w:val="20"/>
-        </w:rPr>
-        <w:t xml:space="preserve">Sole Unity/C# expert on an acquired AR mobile game (Wonderscope) integrating Amira's tutor. Taught Unity to coworkers from scratch, built a custom branching-path extension to the timeline editor, and owned 5 production releases across 102 commits and 48 PRs.</w:t>
-      </w:r>
-    </w:p>
-    <w:p>
-      <w:pPr>
-        <w:pStyle w:val="ListParagraph"/>
-        <w:numPr>
-          <w:ilvl w:val="0"/>
-          <w:numId w:val="2"/>
-        </w:numPr>
-        <w:spacing w:after="30"/>
-      </w:pPr>
-      <w:r>
-        <w:rPr>
-          <w:rFonts w:ascii="Calibri" w:cs="Calibri" w:eastAsia="Calibri" w:hAnsi="Calibri"/>
-          <w:color w:val="1A1712"/>
-          <w:sz w:val="20"/>
-          <w:szCs w:val="20"/>
-        </w:rPr>
-        <w:t xml:space="preserve">Helped design the early Amira Forge platform, contributed to the internal story-curation tool, and built a programmatic After Effects scripting pipeline that generated hundreds of instructional letter-teaching videos.</w:t>
-      </w:r>
-    </w:p>
-    <w:p>
-      <w:pPr>
-        <w:pStyle w:val="ListParagraph"/>
-        <w:numPr>
-          <w:ilvl w:val="0"/>
-          <w:numId w:val="2"/>
-        </w:numPr>
-        <w:spacing w:after="30"/>
-      </w:pPr>
-      <w:r>
-        <w:rPr>
-          <w:rFonts w:ascii="Calibri" w:cs="Calibri" w:eastAsia="Calibri" w:hAnsi="Calibri"/>
-          <w:color w:val="1A1712"/>
-          <w:sz w:val="20"/>
-          <w:szCs w:val="20"/>
-        </w:rPr>
-        <w:t xml:space="preserve">Picked up backend and devops work as needed: GraphQL API contracts, a Lambda + DynamoDB microservice, a GraphQL layer inside a legacy ASP.NET MVC monolith, and lighter Python (Athena, S3) and C# (Istation's ISWeb) work.</w:t>
-      </w:r>
-    </w:p>
-    <w:p>
-      <w:pPr>
-        <w:keepNext/>
-        <w:spacing w:after="30" w:before="80"/>
-      </w:pPr>
-      <w:r>
-        <w:rPr>
-          <w:rFonts w:ascii="Calibri" w:cs="Calibri" w:eastAsia="Calibri" w:hAnsi="Calibri"/>
-          <w:b/>
-          <w:bCs/>
-          <w:color w:val="1A1712"/>
-          <w:sz w:val="20"/>
-          <w:szCs w:val="20"/>
-        </w:rPr>
         <w:t xml:space="preserve">AI-native engineering, daily</w:t>
       </w:r>
     </w:p>
@@ -432,45 +455,45 @@
           <w:sz w:val="20"/>
           <w:szCs w:val="20"/>
         </w:rPr>
-        <w:t xml:space="preserve">Work inside an org-wide AI agent-tooling and MCP-integration stack to debug production issues and build features.</w:t>
-      </w:r>
-    </w:p>
-    <w:p>
-      <w:pPr>
-        <w:pStyle w:val="ListParagraph"/>
-        <w:numPr>
-          <w:ilvl w:val="0"/>
-          <w:numId w:val="2"/>
-        </w:numPr>
-        <w:spacing w:after="30"/>
-      </w:pPr>
-      <w:r>
-        <w:rPr>
-          <w:rFonts w:ascii="Calibri" w:cs="Calibri" w:eastAsia="Calibri" w:hAnsi="Calibri"/>
-          <w:color w:val="1A1712"/>
-          <w:sz w:val="20"/>
-          <w:szCs w:val="20"/>
-        </w:rPr>
-        <w:t xml:space="preserve">Adopted early (ChatGPT, then Cursor) and led internal Cursor adoption when it was the leading tool. Now run primarily through Claude Code, with Copilot, ChatGPT's coding agent, and Gemini as situational fallbacks.</w:t>
-      </w:r>
-    </w:p>
-    <w:p>
-      <w:pPr>
-        <w:pStyle w:val="ListParagraph"/>
-        <w:numPr>
-          <w:ilvl w:val="0"/>
-          <w:numId w:val="2"/>
-        </w:numPr>
-        <w:spacing w:after="30"/>
-      </w:pPr>
-      <w:r>
-        <w:rPr>
-          <w:rFonts w:ascii="Calibri" w:cs="Calibri" w:eastAsia="Calibri" w:hAnsi="Calibri"/>
-          <w:color w:val="1A1712"/>
-          <w:sz w:val="20"/>
-          <w:szCs w:val="20"/>
-        </w:rPr>
-        <w:t xml:space="preserve">Contribute to the team's shared agent-tooling collection, and build my own tools — the projects below — to remove recurring friction.</w:t>
+        <w:t xml:space="preserve">Work through AI agents every day to plan, build, test and debug, including an org-wide agent-tooling and MCP-integration stack for production debugging.</w:t>
+      </w:r>
+    </w:p>
+    <w:p>
+      <w:pPr>
+        <w:pStyle w:val="ListParagraph"/>
+        <w:numPr>
+          <w:ilvl w:val="0"/>
+          <w:numId w:val="2"/>
+        </w:numPr>
+        <w:spacing w:after="30"/>
+      </w:pPr>
+      <w:r>
+        <w:rPr>
+          <w:rFonts w:ascii="Calibri" w:cs="Calibri" w:eastAsia="Calibri" w:hAnsi="Calibri"/>
+          <w:color w:val="1A1712"/>
+          <w:sz w:val="20"/>
+          <w:szCs w:val="20"/>
+        </w:rPr>
+        <w:t xml:space="preserve">Adopted early (ChatGPT, then Cursor) and led internal Cursor adoption. Now run primarily through Claude Code.</w:t>
+      </w:r>
+    </w:p>
+    <w:p>
+      <w:pPr>
+        <w:pStyle w:val="ListParagraph"/>
+        <w:numPr>
+          <w:ilvl w:val="0"/>
+          <w:numId w:val="2"/>
+        </w:numPr>
+        <w:spacing w:after="30"/>
+      </w:pPr>
+      <w:r>
+        <w:rPr>
+          <w:rFonts w:ascii="Calibri" w:cs="Calibri" w:eastAsia="Calibri" w:hAnsi="Calibri"/>
+          <w:color w:val="1A1712"/>
+          <w:sz w:val="20"/>
+          <w:szCs w:val="20"/>
+        </w:rPr>
+        <w:t xml:space="preserve">Build my own agent tools, the projects below, to remove recurring friction.</w:t>
       </w:r>
     </w:p>
     <w:p>
@@ -861,7 +884,7 @@
         </w:rPr>
         <w:t xml:space="preserve">  ·  </w:t>
       </w:r>
-      <w:hyperlink w:history="1" r:id="rIdokrdf8bvslhjfisyr1mog">
+      <w:hyperlink w:history="1" r:id="rIdolriurqy4z6mw2lpqwcdm">
         <w:r>
           <w:rPr>
             <w:rFonts w:ascii="Calibri" w:cs="Calibri" w:eastAsia="Calibri" w:hAnsi="Calibri"/>
@@ -918,7 +941,7 @@
         </w:rPr>
         <w:t xml:space="preserve">  ·  </w:t>
       </w:r>
-      <w:hyperlink w:history="1" r:id="rIdrgcishttrwfjksp5zru30">
+      <w:hyperlink w:history="1" r:id="rIdnfjhljejowixvt1bidoi2">
         <w:r>
           <w:rPr>
             <w:rFonts w:ascii="Calibri" w:cs="Calibri" w:eastAsia="Calibri" w:hAnsi="Calibri"/>
@@ -975,7 +998,7 @@
         </w:rPr>
         <w:t xml:space="preserve">  ·  </w:t>
       </w:r>
-      <w:hyperlink w:history="1" r:id="rIdhoxaek1vfgct4gdm2aofb">
+      <w:hyperlink w:history="1" r:id="rId1q9l-y-pu4npbkyxoksmn">
         <w:r>
           <w:rPr>
             <w:rFonts w:ascii="Calibri" w:cs="Calibri" w:eastAsia="Calibri" w:hAnsi="Calibri"/>
@@ -1032,7 +1055,7 @@
         </w:rPr>
         <w:t xml:space="preserve">  ·  </w:t>
       </w:r>
-      <w:hyperlink w:history="1" r:id="rIdp8qtsye8fdmpehkauqz12">
+      <w:hyperlink w:history="1" r:id="rIdww-eeeyu_dfovk_nvfonw">
         <w:r>
           <w:rPr>
             <w:rFonts w:ascii="Calibri" w:cs="Calibri" w:eastAsia="Calibri" w:hAnsi="Calibri"/>

</xml_diff>

<commit_message>
Rewrite Marqeta, Waitr, Perficient, projects, skills and colophon; drop phone
Title is now Senior software engineer. Marqeta and Waitr get scope
lines. Project cards lose counts. Skills lead with frontend and AI.
Phone number removed from the site and the docx.

Co-Authored-By: Claude Sonnet 5.5 <noreply@anthropic.com>
</commit_message>
<xml_diff>
--- a/resume/Tory-Hebert-Resume.docx
+++ b/resume/Tory-Hebert-Resume.docx
@@ -29,14 +29,14 @@
           <w:sz w:val="21"/>
           <w:szCs w:val="21"/>
         </w:rPr>
-        <w:t xml:space="preserve">Software engineer · AI-native · Frontend-first, growing full stack · Lafayette, LA (remote)</w:t>
+        <w:t xml:space="preserve">Senior software engineer · AI-native · Frontend-first, growing full stack · Lafayette, LA (remote)</w:t>
       </w:r>
     </w:p>
     <w:p>
       <w:pPr>
         <w:spacing w:after="60"/>
       </w:pPr>
-      <w:hyperlink w:history="1" r:id="rIdqmh_cjidjvisfrmgtxmd5">
+      <w:hyperlink w:history="1" r:id="rIdogivjgy279qcqyuotmn6y">
         <w:r>
           <w:rPr>
             <w:rFonts w:ascii="Calibri" w:cs="Calibri" w:eastAsia="Calibri" w:hAnsi="Calibri"/>
@@ -53,24 +53,7 @@
         </w:rPr>
         <w:t xml:space="preserve">  ·  </w:t>
       </w:r>
-      <w:hyperlink w:history="1" r:id="rIdxpqkf9ddw7bz4hcs2gn1q">
-        <w:r>
-          <w:rPr>
-            <w:rFonts w:ascii="Calibri" w:cs="Calibri" w:eastAsia="Calibri" w:hAnsi="Calibri"/>
-            <w:color w:val="1A1712"/>
-            <w:u w:val="single"/>
-          </w:rPr>
-          <w:t xml:space="preserve">(337) 380-0038</w:t>
-        </w:r>
-      </w:hyperlink>
-      <w:r>
-        <w:rPr>
-          <w:rFonts w:ascii="Calibri" w:cs="Calibri" w:eastAsia="Calibri" w:hAnsi="Calibri"/>
-          <w:color w:val="5A554C"/>
-        </w:rPr>
-        <w:t xml:space="preserve">  ·  </w:t>
-      </w:r>
-      <w:hyperlink w:history="1" r:id="rId0gndk-j3de-9utbvxqpoc">
+      <w:hyperlink w:history="1" r:id="rId3cykmhuw6oru6n_ybxth6">
         <w:r>
           <w:rPr>
             <w:rFonts w:ascii="Calibri" w:cs="Calibri" w:eastAsia="Calibri" w:hAnsi="Calibri"/>
@@ -87,7 +70,7 @@
         </w:rPr>
         <w:t xml:space="preserve">  ·  </w:t>
       </w:r>
-      <w:hyperlink w:history="1" r:id="rIdvn7knqd-_nmnci_ru_hl5">
+      <w:hyperlink w:history="1" r:id="rId74z2wueugfzewgyvxl1qg">
         <w:r>
           <w:rPr>
             <w:rFonts w:ascii="Calibri" w:cs="Calibri" w:eastAsia="Calibri" w:hAnsi="Calibri"/>
@@ -542,97 +525,95 @@
     </w:p>
     <w:p>
       <w:pPr>
-        <w:pStyle w:val="ListParagraph"/>
-        <w:numPr>
-          <w:ilvl w:val="0"/>
-          <w:numId w:val="2"/>
-        </w:numPr>
-        <w:spacing w:after="30"/>
-      </w:pPr>
-      <w:r>
-        <w:rPr>
-          <w:rFonts w:ascii="Calibri" w:cs="Calibri" w:eastAsia="Calibri" w:hAnsi="Calibri"/>
-          <w:color w:val="1A1712"/>
-          <w:sz w:val="20"/>
-          <w:szCs w:val="20"/>
-        </w:rPr>
-        <w:t xml:space="preserve">Owned and maintained the Three Domain Secure (3DS) admin configuration panel and customer-facing forms (React, Node.js, Mustache).</w:t>
-      </w:r>
-    </w:p>
-    <w:p>
-      <w:pPr>
-        <w:pStyle w:val="ListParagraph"/>
-        <w:numPr>
-          <w:ilvl w:val="0"/>
-          <w:numId w:val="2"/>
-        </w:numPr>
-        <w:spacing w:after="30"/>
-      </w:pPr>
-      <w:r>
-        <w:rPr>
-          <w:rFonts w:ascii="Calibri" w:cs="Calibri" w:eastAsia="Calibri" w:hAnsi="Calibri"/>
-          <w:color w:val="1A1712"/>
-          <w:sz w:val="20"/>
-          <w:szCs w:val="20"/>
-        </w:rPr>
-        <w:t xml:space="preserve">Contributed to the 3DS backend service (Java, Spark) and its AWS infrastructure (Terraform-managed Lambda, API Gateway, SNS, SQS, S3, DynamoDB, CloudWatch).</w:t>
-      </w:r>
-    </w:p>
-    <w:p>
-      <w:pPr>
-        <w:pStyle w:val="ListParagraph"/>
-        <w:numPr>
-          <w:ilvl w:val="0"/>
-          <w:numId w:val="2"/>
-        </w:numPr>
-        <w:spacing w:after="30"/>
-      </w:pPr>
-      <w:r>
-        <w:rPr>
-          <w:rFonts w:ascii="Calibri" w:cs="Calibri" w:eastAsia="Calibri" w:hAnsi="Calibri"/>
-          <w:color w:val="1A1712"/>
-          <w:sz w:val="20"/>
-          <w:szCs w:val="20"/>
-        </w:rPr>
-        <w:t xml:space="preserve">Wrote integration and unit tests for the Java and JavaScript codebases, plus Gatling performance tests in Scala.</w:t>
-      </w:r>
-    </w:p>
-    <w:p>
-      <w:pPr>
-        <w:pStyle w:val="ListParagraph"/>
-        <w:numPr>
-          <w:ilvl w:val="0"/>
-          <w:numId w:val="2"/>
-        </w:numPr>
-        <w:spacing w:after="30"/>
-      </w:pPr>
-      <w:r>
-        <w:rPr>
-          <w:rFonts w:ascii="Calibri" w:cs="Calibri" w:eastAsia="Calibri" w:hAnsi="Calibri"/>
-          <w:color w:val="1A1712"/>
-          <w:sz w:val="20"/>
-          <w:szCs w:val="20"/>
-        </w:rPr>
-        <w:t xml:space="preserve">Created designs and documentation, ran knowledge-sharing sessions, and supported 3DS auditing.</w:t>
-      </w:r>
-    </w:p>
-    <w:p>
-      <w:pPr>
-        <w:pStyle w:val="ListParagraph"/>
-        <w:numPr>
-          <w:ilvl w:val="0"/>
-          <w:numId w:val="2"/>
-        </w:numPr>
-        <w:spacing w:after="30"/>
-      </w:pPr>
-      <w:r>
-        <w:rPr>
-          <w:rFonts w:ascii="Calibri" w:cs="Calibri" w:eastAsia="Calibri" w:hAnsi="Calibri"/>
-          <w:color w:val="1A1712"/>
-          <w:sz w:val="20"/>
-          <w:szCs w:val="20"/>
-        </w:rPr>
-        <w:t xml:space="preserve">Mentored a summer intern and was primary onboarding mentor for two new hires in Q1 2022.</w:t>
+        <w:keepNext/>
+        <w:spacing w:after="30"/>
+      </w:pPr>
+      <w:r>
+        <w:rPr>
+          <w:rFonts w:ascii="Calibri" w:cs="Calibri" w:eastAsia="Calibri" w:hAnsi="Calibri"/>
+          <w:i/>
+          <w:iCs/>
+          <w:color w:val="5A554C"/>
+          <w:sz w:val="19"/>
+          <w:szCs w:val="19"/>
+        </w:rPr>
+        <w:t xml:space="preserve">Marqeta's in-house 3-D Secure service, the card-payment authentication step that confirms a cardholder is who they say they are. Launched in 2020 as one of the first verified on Visa's 3DS 2.2 standard.</w:t>
+      </w:r>
+    </w:p>
+    <w:p>
+      <w:pPr>
+        <w:pStyle w:val="ListParagraph"/>
+        <w:numPr>
+          <w:ilvl w:val="0"/>
+          <w:numId w:val="2"/>
+        </w:numPr>
+        <w:spacing w:after="30"/>
+      </w:pPr>
+      <w:r>
+        <w:rPr>
+          <w:rFonts w:ascii="Calibri" w:cs="Calibri" w:eastAsia="Calibri" w:hAnsi="Calibri"/>
+          <w:color w:val="1A1712"/>
+          <w:sz w:val="20"/>
+          <w:szCs w:val="20"/>
+        </w:rPr>
+        <w:t xml:space="preserve">Owned the admin configuration panel and the customer-facing authentication forms, in React and Node.js.</w:t>
+      </w:r>
+    </w:p>
+    <w:p>
+      <w:pPr>
+        <w:pStyle w:val="ListParagraph"/>
+        <w:numPr>
+          <w:ilvl w:val="0"/>
+          <w:numId w:val="2"/>
+        </w:numPr>
+        <w:spacing w:after="30"/>
+      </w:pPr>
+      <w:r>
+        <w:rPr>
+          <w:rFonts w:ascii="Calibri" w:cs="Calibri" w:eastAsia="Calibri" w:hAnsi="Calibri"/>
+          <w:color w:val="1A1712"/>
+          <w:sz w:val="20"/>
+          <w:szCs w:val="20"/>
+        </w:rPr>
+        <w:t xml:space="preserve">Moved to full-time Java on the backend and its AWS infrastructure, and wrote the unit, integration and load tests.</w:t>
+      </w:r>
+    </w:p>
+    <w:p>
+      <w:pPr>
+        <w:pStyle w:val="ListParagraph"/>
+        <w:numPr>
+          <w:ilvl w:val="0"/>
+          <w:numId w:val="2"/>
+        </w:numPr>
+        <w:spacing w:after="30"/>
+      </w:pPr>
+      <w:r>
+        <w:rPr>
+          <w:rFonts w:ascii="Calibri" w:cs="Calibri" w:eastAsia="Calibri" w:hAnsi="Calibri"/>
+          <w:color w:val="1A1712"/>
+          <w:sz w:val="20"/>
+          <w:szCs w:val="20"/>
+        </w:rPr>
+        <w:t xml:space="preserve">Wrote design docs, supported compliance audits, and ran knowledge-sharing sessions.</w:t>
+      </w:r>
+    </w:p>
+    <w:p>
+      <w:pPr>
+        <w:pStyle w:val="ListParagraph"/>
+        <w:numPr>
+          <w:ilvl w:val="0"/>
+          <w:numId w:val="2"/>
+        </w:numPr>
+        <w:spacing w:after="30"/>
+      </w:pPr>
+      <w:r>
+        <w:rPr>
+          <w:rFonts w:ascii="Calibri" w:cs="Calibri" w:eastAsia="Calibri" w:hAnsi="Calibri"/>
+          <w:color w:val="1A1712"/>
+          <w:sz w:val="20"/>
+          <w:szCs w:val="20"/>
+        </w:rPr>
+        <w:t xml:space="preserve">Mentored a summer intern and onboarded two new engineers.</w:t>
       </w:r>
     </w:p>
     <w:p>
@@ -681,59 +662,76 @@
     </w:p>
     <w:p>
       <w:pPr>
-        <w:pStyle w:val="ListParagraph"/>
-        <w:numPr>
-          <w:ilvl w:val="0"/>
-          <w:numId w:val="2"/>
-        </w:numPr>
-        <w:spacing w:after="30"/>
-      </w:pPr>
-      <w:r>
-        <w:rPr>
-          <w:rFonts w:ascii="Calibri" w:cs="Calibri" w:eastAsia="Calibri" w:hAnsi="Calibri"/>
-          <w:color w:val="1A1712"/>
-          <w:sz w:val="20"/>
-          <w:szCs w:val="20"/>
-        </w:rPr>
-        <w:t xml:space="preserve">Contributed to Waitr's customer-facing web ordering application (React, Redux, Thunk), fixing bugs and implementing features from product and design specs.</w:t>
-      </w:r>
-    </w:p>
-    <w:p>
-      <w:pPr>
-        <w:pStyle w:val="ListParagraph"/>
-        <w:numPr>
-          <w:ilvl w:val="0"/>
-          <w:numId w:val="2"/>
-        </w:numPr>
-        <w:spacing w:after="30"/>
-      </w:pPr>
-      <w:r>
-        <w:rPr>
-          <w:rFonts w:ascii="Calibri" w:cs="Calibri" w:eastAsia="Calibri" w:hAnsi="Calibri"/>
-          <w:color w:val="1A1712"/>
-          <w:sz w:val="20"/>
-          <w:szCs w:val="20"/>
-        </w:rPr>
-        <w:t xml:space="preserve">Introduced Jest to the codebase and migrated the existing Chai test suites.</w:t>
-      </w:r>
-    </w:p>
-    <w:p>
-      <w:pPr>
-        <w:pStyle w:val="ListParagraph"/>
-        <w:numPr>
-          <w:ilvl w:val="0"/>
-          <w:numId w:val="2"/>
-        </w:numPr>
-        <w:spacing w:after="30"/>
-      </w:pPr>
-      <w:r>
-        <w:rPr>
-          <w:rFonts w:ascii="Calibri" w:cs="Calibri" w:eastAsia="Calibri" w:hAnsi="Calibri"/>
-          <w:color w:val="1A1712"/>
-          <w:sz w:val="20"/>
-          <w:szCs w:val="20"/>
-        </w:rPr>
-        <w:t xml:space="preserve">Primary technical owner of an in-house AngularJS order-management product used internally and by restaurant partners: advised a small group of engineers, turned requirements into working solutions, and supported deployment and configuration updates.</w:t>
+        <w:keepNext/>
+        <w:spacing w:after="30"/>
+      </w:pPr>
+      <w:r>
+        <w:rPr>
+          <w:rFonts w:ascii="Calibri" w:cs="Calibri" w:eastAsia="Calibri" w:hAnsi="Calibri"/>
+          <w:i/>
+          <w:iCs/>
+          <w:color w:val="5A554C"/>
+          <w:sz w:val="19"/>
+          <w:szCs w:val="19"/>
+        </w:rPr>
+        <w:t xml:space="preserve">Waitr's food-delivery platform, which reached 2.4M active diners and 20,000+ restaurants by 2019.</w:t>
+      </w:r>
+    </w:p>
+    <w:p>
+      <w:pPr>
+        <w:pStyle w:val="ListParagraph"/>
+        <w:numPr>
+          <w:ilvl w:val="0"/>
+          <w:numId w:val="2"/>
+        </w:numPr>
+        <w:spacing w:after="30"/>
+      </w:pPr>
+      <w:r>
+        <w:rPr>
+          <w:rFonts w:ascii="Calibri" w:cs="Calibri" w:eastAsia="Calibri" w:hAnsi="Calibri"/>
+          <w:color w:val="1A1712"/>
+          <w:sz w:val="20"/>
+          <w:szCs w:val="20"/>
+        </w:rPr>
+        <w:t xml:space="preserve">Built features for the customer-facing web ordering app (React, Redux), working from product and design specs.</w:t>
+      </w:r>
+    </w:p>
+    <w:p>
+      <w:pPr>
+        <w:pStyle w:val="ListParagraph"/>
+        <w:numPr>
+          <w:ilvl w:val="0"/>
+          <w:numId w:val="2"/>
+        </w:numPr>
+        <w:spacing w:after="30"/>
+      </w:pPr>
+      <w:r>
+        <w:rPr>
+          <w:rFonts w:ascii="Calibri" w:cs="Calibri" w:eastAsia="Calibri" w:hAnsi="Calibri"/>
+          <w:color w:val="1A1712"/>
+          <w:sz w:val="20"/>
+          <w:szCs w:val="20"/>
+        </w:rPr>
+        <w:t xml:space="preserve">Introduced Jest and migrated the existing Chai test suites.</w:t>
+      </w:r>
+    </w:p>
+    <w:p>
+      <w:pPr>
+        <w:pStyle w:val="ListParagraph"/>
+        <w:numPr>
+          <w:ilvl w:val="0"/>
+          <w:numId w:val="2"/>
+        </w:numPr>
+        <w:spacing w:after="30"/>
+      </w:pPr>
+      <w:r>
+        <w:rPr>
+          <w:rFonts w:ascii="Calibri" w:cs="Calibri" w:eastAsia="Calibri" w:hAnsi="Calibri"/>
+          <w:color w:val="1A1712"/>
+          <w:sz w:val="20"/>
+          <w:szCs w:val="20"/>
+        </w:rPr>
+        <w:t xml:space="preserve">Primary technical owner of an in-house AngularJS order-management product used by Waitr staff and restaurant partners. Advised a small group of engineers from requirements through deployment, and worked directly with support staff.</w:t>
       </w:r>
     </w:p>
     <w:p>
@@ -815,7 +813,7 @@
           <w:sz w:val="20"/>
           <w:szCs w:val="20"/>
         </w:rPr>
-        <w:t xml:space="preserve">Wrote unit tests in Karma, Jasmine, and PhantomJS.</w:t>
+        <w:t xml:space="preserve">Worked embedded in the client's team, and wrote the unit tests in Karma and Jasmine.</w:t>
       </w:r>
     </w:p>
     <w:p>
@@ -861,7 +859,7 @@
           <w:sz w:val="20"/>
           <w:szCs w:val="20"/>
         </w:rPr>
-        <w:t xml:space="preserve"> — One AI agent setup, portable across machines and across Claude Code, Gemini CLI, and Cursor CLI.</w:t>
+        <w:t xml:space="preserve"> — One agent setup, portable across Claude Code, Gemini CLI, and Cursor CLI.</w:t>
       </w:r>
     </w:p>
     <w:p>
@@ -884,7 +882,7 @@
         </w:rPr>
         <w:t xml:space="preserve">  ·  </w:t>
       </w:r>
-      <w:hyperlink w:history="1" r:id="rIdolriurqy4z6mw2lpqwcdm">
+      <w:hyperlink w:history="1" r:id="rIddneaiic8nuayiriggyyqk">
         <w:r>
           <w:rPr>
             <w:rFonts w:ascii="Calibri" w:cs="Calibri" w:eastAsia="Calibri" w:hAnsi="Calibri"/>
@@ -941,7 +939,7 @@
         </w:rPr>
         <w:t xml:space="preserve">  ·  </w:t>
       </w:r>
-      <w:hyperlink w:history="1" r:id="rIdnfjhljejowixvt1bidoi2">
+      <w:hyperlink w:history="1" r:id="rIdtmpgfbxw-l4suar3iapfb">
         <w:r>
           <w:rPr>
             <w:rFonts w:ascii="Calibri" w:cs="Calibri" w:eastAsia="Calibri" w:hAnsi="Calibri"/>
@@ -975,7 +973,7 @@
           <w:sz w:val="20"/>
           <w:szCs w:val="20"/>
         </w:rPr>
-        <w:t xml:space="preserve"> — Early warning and safe relief for memory exhaustion, so the out-of-memory dialog stops being the first notice.</w:t>
+        <w:t xml:space="preserve"> — Early warning and safe relief for memory exhaustion, before the out-of-memory dialog.</w:t>
       </w:r>
     </w:p>
     <w:p>
@@ -998,7 +996,7 @@
         </w:rPr>
         <w:t xml:space="preserve">  ·  </w:t>
       </w:r>
-      <w:hyperlink w:history="1" r:id="rId1q9l-y-pu4npbkyxoksmn">
+      <w:hyperlink w:history="1" r:id="rIdu5y9lgggyr1hpmjbmsu-m">
         <w:r>
           <w:rPr>
             <w:rFonts w:ascii="Calibri" w:cs="Calibri" w:eastAsia="Calibri" w:hAnsi="Calibri"/>
@@ -1032,7 +1030,7 @@
           <w:sz w:val="20"/>
           <w:szCs w:val="20"/>
         </w:rPr>
-        <w:t xml:space="preserve"> — Ten Manifest V3 extensions I use day to day. No build step, no dependencies.</w:t>
+        <w:t xml:space="preserve"> — Manifest V3 extensions I use daily in my professional workflow. No build step, no dependencies.</w:t>
       </w:r>
     </w:p>
     <w:p>
@@ -1055,7 +1053,7 @@
         </w:rPr>
         <w:t xml:space="preserve">  ·  </w:t>
       </w:r>
-      <w:hyperlink w:history="1" r:id="rIdww-eeeyu_dfovk_nvfonw">
+      <w:hyperlink w:history="1" r:id="rIdcyalv5ih675csjyvf3hkn">
         <w:r>
           <w:rPr>
             <w:rFonts w:ascii="Calibri" w:cs="Calibri" w:eastAsia="Calibri" w:hAnsi="Calibri"/>
@@ -1089,7 +1087,7 @@
           <w:sz w:val="20"/>
           <w:szCs w:val="20"/>
         </w:rPr>
-        <w:t xml:space="preserve"> — A household recipe and meal-planning app: pantry, cookbook, weekly menu, shopping list, and a "30 plants a week" tracker.</w:t>
+        <w:t xml:space="preserve"> — A household recipe and meal-planning app: pantry, cookbook, weekly menu, and shopping list. Used by me and my partner.</w:t>
       </w:r>
     </w:p>
     <w:p>
@@ -1143,7 +1141,7 @@
           <w:sz w:val="20"/>
           <w:szCs w:val="20"/>
         </w:rPr>
-        <w:t xml:space="preserve">JavaScript / TypeScript, React, AI / agentic engineering, Node.js, Next.js, GraphQL, AWS (Lambda, AppSync, DynamoDB), Redux, Angular, Java, C#, Python, Unity / WebGL, SQL / Postgres, Docker / Terraform, Scrum / Agile</w:t>
+        <w:t xml:space="preserve">TypeScript / JavaScript, React, Angular, AI-native engineering, Claude Code, Cursor, MCP, Node.js, Next.js, Redux, GraphQL, Python, AWS (AppSync, Lambda, DynamoDB), Java, C# / Unity, SQL / Postgres, Terraform, Docker</w:t>
       </w:r>
     </w:p>
     <w:p>

</xml_diff>

<commit_message>
Add docx download, fix print page break, rename preview tool
The Amira role was a grid in print, so Chrome pushed it to page two
and left a gap after the hero. Print body font drops to 9.5pt so the
resume fits three pages. The preview tool no longer carries its
internal name.

Co-Authored-By: Claude Sonnet 5.5 <noreply@anthropic.com>
</commit_message>
<xml_diff>
--- a/resume/Tory-Hebert-Resume.docx
+++ b/resume/Tory-Hebert-Resume.docx
@@ -36,7 +36,7 @@
       <w:pPr>
         <w:spacing w:after="60"/>
       </w:pPr>
-      <w:hyperlink w:history="1" r:id="rIdogivjgy279qcqyuotmn6y">
+      <w:hyperlink w:history="1" r:id="rIdo0qjblesir8v7bdvhsnwv">
         <w:r>
           <w:rPr>
             <w:rFonts w:ascii="Calibri" w:cs="Calibri" w:eastAsia="Calibri" w:hAnsi="Calibri"/>
@@ -53,7 +53,7 @@
         </w:rPr>
         <w:t xml:space="preserve">  ·  </w:t>
       </w:r>
-      <w:hyperlink w:history="1" r:id="rId3cykmhuw6oru6n_ybxth6">
+      <w:hyperlink w:history="1" r:id="rIdw2fbqfasovcen_vuahvii">
         <w:r>
           <w:rPr>
             <w:rFonts w:ascii="Calibri" w:cs="Calibri" w:eastAsia="Calibri" w:hAnsi="Calibri"/>
@@ -70,7 +70,7 @@
         </w:rPr>
         <w:t xml:space="preserve">  ·  </w:t>
       </w:r>
-      <w:hyperlink w:history="1" r:id="rId74z2wueugfzewgyvxl1qg">
+      <w:hyperlink w:history="1" r:id="rIdkedb7t1mwxmyqsdrln8dr">
         <w:r>
           <w:rPr>
             <w:rFonts w:ascii="Calibri" w:cs="Calibri" w:eastAsia="Calibri" w:hAnsi="Calibri"/>
@@ -364,7 +364,7 @@
           <w:sz w:val="20"/>
           <w:szCs w:val="20"/>
         </w:rPr>
-        <w:t xml:space="preserve">Built lexa-preview, a tool that plays any assessment item directly in the reading client. Learning designers and client developers no longer have to assign a full assessment and sit through the multi-minute flow to preview one item, even when the item doesn't exist in that environment yet.</w:t>
+        <w:t xml:space="preserve">Built the Assessment Preview Tool, which plays any assessment item directly in the reading client. Learning designers and client developers no longer have to assign a full assessment and sit through the multi-minute flow to preview one item, even when the item doesn't exist in that environment yet.</w:t>
       </w:r>
     </w:p>
     <w:p>
@@ -882,7 +882,7 @@
         </w:rPr>
         <w:t xml:space="preserve">  ·  </w:t>
       </w:r>
-      <w:hyperlink w:history="1" r:id="rIddneaiic8nuayiriggyyqk">
+      <w:hyperlink w:history="1" r:id="rIdebgpatu0gulcibadbkv8k">
         <w:r>
           <w:rPr>
             <w:rFonts w:ascii="Calibri" w:cs="Calibri" w:eastAsia="Calibri" w:hAnsi="Calibri"/>
@@ -939,7 +939,7 @@
         </w:rPr>
         <w:t xml:space="preserve">  ·  </w:t>
       </w:r>
-      <w:hyperlink w:history="1" r:id="rIdtmpgfbxw-l4suar3iapfb">
+      <w:hyperlink w:history="1" r:id="rId7t1lx16o6j94kxmdckq4o">
         <w:r>
           <w:rPr>
             <w:rFonts w:ascii="Calibri" w:cs="Calibri" w:eastAsia="Calibri" w:hAnsi="Calibri"/>
@@ -996,7 +996,7 @@
         </w:rPr>
         <w:t xml:space="preserve">  ·  </w:t>
       </w:r>
-      <w:hyperlink w:history="1" r:id="rIdu5y9lgggyr1hpmjbmsu-m">
+      <w:hyperlink w:history="1" r:id="rId6lj_rhyhbuymsctkli0sc">
         <w:r>
           <w:rPr>
             <w:rFonts w:ascii="Calibri" w:cs="Calibri" w:eastAsia="Calibri" w:hAnsi="Calibri"/>
@@ -1053,7 +1053,7 @@
         </w:rPr>
         <w:t xml:space="preserve">  ·  </w:t>
       </w:r>
-      <w:hyperlink w:history="1" r:id="rIdcyalv5ih675csjyvf3hkn">
+      <w:hyperlink w:history="1" r:id="rId9oo_gj-qbfqbhnziyrf2p">
         <w:r>
           <w:rPr>
             <w:rFonts w:ascii="Calibri" w:cs="Calibri" w:eastAsia="Calibri" w:hAnsi="Calibri"/>

</xml_diff>

<commit_message>
Put city and state in the docx contact line
Resume reviewers and ATS parsers read the contact line for location.

Co-Authored-By: Claude Sonnet 5.5 <noreply@anthropic.com>
</commit_message>
<xml_diff>
--- a/resume/Tory-Hebert-Resume.docx
+++ b/resume/Tory-Hebert-Resume.docx
@@ -29,14 +29,28 @@
           <w:sz w:val="21"/>
           <w:szCs w:val="21"/>
         </w:rPr>
-        <w:t xml:space="preserve">Senior software engineer · AI-native · Frontend-first, growing full stack · Lafayette, LA (remote)</w:t>
+        <w:t xml:space="preserve">Senior software engineer · AI-native · Frontend-first, growing full stack</w:t>
       </w:r>
     </w:p>
     <w:p>
       <w:pPr>
         <w:spacing w:after="60"/>
       </w:pPr>
-      <w:hyperlink w:history="1" r:id="rIdo0qjblesir8v7bdvhsnwv">
+      <w:r>
+        <w:rPr>
+          <w:rFonts w:ascii="Calibri" w:cs="Calibri" w:eastAsia="Calibri" w:hAnsi="Calibri"/>
+          <w:color w:val="1A1712"/>
+        </w:rPr>
+        <w:t xml:space="preserve">Lafayette, LA (remote)</w:t>
+      </w:r>
+      <w:r>
+        <w:rPr>
+          <w:rFonts w:ascii="Calibri" w:cs="Calibri" w:eastAsia="Calibri" w:hAnsi="Calibri"/>
+          <w:color w:val="5A554C"/>
+        </w:rPr>
+        <w:t xml:space="preserve">  ·  </w:t>
+      </w:r>
+      <w:hyperlink w:history="1" r:id="rIdqbrddqogjndxf3vq3ldid">
         <w:r>
           <w:rPr>
             <w:rFonts w:ascii="Calibri" w:cs="Calibri" w:eastAsia="Calibri" w:hAnsi="Calibri"/>
@@ -53,7 +67,7 @@
         </w:rPr>
         <w:t xml:space="preserve">  ·  </w:t>
       </w:r>
-      <w:hyperlink w:history="1" r:id="rIdw2fbqfasovcen_vuahvii">
+      <w:hyperlink w:history="1" r:id="rIdqlbj_4xlfncvmf_--pjrm">
         <w:r>
           <w:rPr>
             <w:rFonts w:ascii="Calibri" w:cs="Calibri" w:eastAsia="Calibri" w:hAnsi="Calibri"/>
@@ -70,7 +84,7 @@
         </w:rPr>
         <w:t xml:space="preserve">  ·  </w:t>
       </w:r>
-      <w:hyperlink w:history="1" r:id="rIdkedb7t1mwxmyqsdrln8dr">
+      <w:hyperlink w:history="1" r:id="rIdj4c5-ynfti79yeiwgcvvf">
         <w:r>
           <w:rPr>
             <w:rFonts w:ascii="Calibri" w:cs="Calibri" w:eastAsia="Calibri" w:hAnsi="Calibri"/>
@@ -882,7 +896,7 @@
         </w:rPr>
         <w:t xml:space="preserve">  ·  </w:t>
       </w:r>
-      <w:hyperlink w:history="1" r:id="rIdebgpatu0gulcibadbkv8k">
+      <w:hyperlink w:history="1" r:id="rIdmpvaielzea7kkdsua9yhj">
         <w:r>
           <w:rPr>
             <w:rFonts w:ascii="Calibri" w:cs="Calibri" w:eastAsia="Calibri" w:hAnsi="Calibri"/>
@@ -939,7 +953,7 @@
         </w:rPr>
         <w:t xml:space="preserve">  ·  </w:t>
       </w:r>
-      <w:hyperlink w:history="1" r:id="rId7t1lx16o6j94kxmdckq4o">
+      <w:hyperlink w:history="1" r:id="rId8fnt8cgxmwolv8mcgaoao">
         <w:r>
           <w:rPr>
             <w:rFonts w:ascii="Calibri" w:cs="Calibri" w:eastAsia="Calibri" w:hAnsi="Calibri"/>
@@ -996,7 +1010,7 @@
         </w:rPr>
         <w:t xml:space="preserve">  ·  </w:t>
       </w:r>
-      <w:hyperlink w:history="1" r:id="rId6lj_rhyhbuymsctkli0sc">
+      <w:hyperlink w:history="1" r:id="rIdaopqmkh9gi7em_gbqhj0o">
         <w:r>
           <w:rPr>
             <w:rFonts w:ascii="Calibri" w:cs="Calibri" w:eastAsia="Calibri" w:hAnsi="Calibri"/>
@@ -1053,7 +1067,7 @@
         </w:rPr>
         <w:t xml:space="preserve">  ·  </w:t>
       </w:r>
-      <w:hyperlink w:history="1" r:id="rId9oo_gj-qbfqbhnziyrf2p">
+      <w:hyperlink w:history="1" r:id="rId9i2rbh2hxabbf2s-39bsl">
         <w:r>
           <w:rPr>
             <w:rFonts w:ascii="Calibri" w:cs="Calibri" w:eastAsia="Calibri" w:hAnsi="Calibri"/>

</xml_diff>

<commit_message>
Add toryh.dev to the docx contact line and set canonical URL
The site now serves from the custom domain.

Co-Authored-By: Claude Sonnet 5.5 <noreply@anthropic.com>
</commit_message>
<xml_diff>
--- a/resume/Tory-Hebert-Resume.docx
+++ b/resume/Tory-Hebert-Resume.docx
@@ -50,7 +50,7 @@
         </w:rPr>
         <w:t xml:space="preserve">  ·  </w:t>
       </w:r>
-      <w:hyperlink w:history="1" r:id="rIdqbrddqogjndxf3vq3ldid">
+      <w:hyperlink w:history="1" r:id="rIdc9qtpi-etilcheyno6leg">
         <w:r>
           <w:rPr>
             <w:rFonts w:ascii="Calibri" w:cs="Calibri" w:eastAsia="Calibri" w:hAnsi="Calibri"/>
@@ -67,7 +67,24 @@
         </w:rPr>
         <w:t xml:space="preserve">  ·  </w:t>
       </w:r>
-      <w:hyperlink w:history="1" r:id="rIdqlbj_4xlfncvmf_--pjrm">
+      <w:hyperlink w:history="1" r:id="rIdaml2p8jifjba2ngliobeh">
+        <w:r>
+          <w:rPr>
+            <w:rFonts w:ascii="Calibri" w:cs="Calibri" w:eastAsia="Calibri" w:hAnsi="Calibri"/>
+            <w:color w:val="1A1712"/>
+            <w:u w:val="single"/>
+          </w:rPr>
+          <w:t xml:space="preserve">toryh.dev</w:t>
+        </w:r>
+      </w:hyperlink>
+      <w:r>
+        <w:rPr>
+          <w:rFonts w:ascii="Calibri" w:cs="Calibri" w:eastAsia="Calibri" w:hAnsi="Calibri"/>
+          <w:color w:val="5A554C"/>
+        </w:rPr>
+        <w:t xml:space="preserve">  ·  </w:t>
+      </w:r>
+      <w:hyperlink w:history="1" r:id="rIdte5emzir8onwwjoeevr2i">
         <w:r>
           <w:rPr>
             <w:rFonts w:ascii="Calibri" w:cs="Calibri" w:eastAsia="Calibri" w:hAnsi="Calibri"/>
@@ -84,7 +101,7 @@
         </w:rPr>
         <w:t xml:space="preserve">  ·  </w:t>
       </w:r>
-      <w:hyperlink w:history="1" r:id="rIdj4c5-ynfti79yeiwgcvvf">
+      <w:hyperlink w:history="1" r:id="rIdb3pw9xavjrobazkiiobuc">
         <w:r>
           <w:rPr>
             <w:rFonts w:ascii="Calibri" w:cs="Calibri" w:eastAsia="Calibri" w:hAnsi="Calibri"/>
@@ -896,7 +913,7 @@
         </w:rPr>
         <w:t xml:space="preserve">  ·  </w:t>
       </w:r>
-      <w:hyperlink w:history="1" r:id="rIdmpvaielzea7kkdsua9yhj">
+      <w:hyperlink w:history="1" r:id="rIdicgxjlr6iq4qpdzzntykb">
         <w:r>
           <w:rPr>
             <w:rFonts w:ascii="Calibri" w:cs="Calibri" w:eastAsia="Calibri" w:hAnsi="Calibri"/>
@@ -953,7 +970,7 @@
         </w:rPr>
         <w:t xml:space="preserve">  ·  </w:t>
       </w:r>
-      <w:hyperlink w:history="1" r:id="rId8fnt8cgxmwolv8mcgaoao">
+      <w:hyperlink w:history="1" r:id="rIdkpdz6bipcfavhnntcetks">
         <w:r>
           <w:rPr>
             <w:rFonts w:ascii="Calibri" w:cs="Calibri" w:eastAsia="Calibri" w:hAnsi="Calibri"/>
@@ -1010,7 +1027,7 @@
         </w:rPr>
         <w:t xml:space="preserve">  ·  </w:t>
       </w:r>
-      <w:hyperlink w:history="1" r:id="rIdaopqmkh9gi7em_gbqhj0o">
+      <w:hyperlink w:history="1" r:id="rIdegxmdmi9gqfbabho_edni">
         <w:r>
           <w:rPr>
             <w:rFonts w:ascii="Calibri" w:cs="Calibri" w:eastAsia="Calibri" w:hAnsi="Calibri"/>
@@ -1067,7 +1084,7 @@
         </w:rPr>
         <w:t xml:space="preserve">  ·  </w:t>
       </w:r>
-      <w:hyperlink w:history="1" r:id="rId9i2rbh2hxabbf2s-39bsl">
+      <w:hyperlink w:history="1" r:id="rIdbjvwb7vmt0z59-yregs2d">
         <w:r>
           <w:rPr>
             <w:rFonts w:ascii="Calibri" w:cs="Calibri" w:eastAsia="Calibri" w:hAnsi="Calibri"/>

</xml_diff>

<commit_message>
State remote-only in resume and site, add PDF download
Co-Authored-By: Claude Sonnet 5.5 <noreply@anthropic.com>
Claude-Session: https://claude.ai/code/session_01P5MGjwqYWyv4xrt55efzsH
</commit_message>
<xml_diff>
--- a/resume/Tory-Hebert-Resume.docx
+++ b/resume/Tory-Hebert-Resume.docx
@@ -41,7 +41,7 @@
           <w:rFonts w:ascii="Calibri" w:cs="Calibri" w:eastAsia="Calibri" w:hAnsi="Calibri"/>
           <w:color w:val="1A1712"/>
         </w:rPr>
-        <w:t xml:space="preserve">Lafayette, LA (remote)</w:t>
+        <w:t xml:space="preserve">Lafayette, LA (remote only)</w:t>
       </w:r>
       <w:r>
         <w:rPr>
@@ -50,7 +50,7 @@
         </w:rPr>
         <w:t xml:space="preserve">  ·  </w:t>
       </w:r>
-      <w:hyperlink w:history="1" r:id="rIdc9qtpi-etilcheyno6leg">
+      <w:hyperlink w:history="1" r:id="rIdkvr_x48wn5_a3fo8aorj0">
         <w:r>
           <w:rPr>
             <w:rFonts w:ascii="Calibri" w:cs="Calibri" w:eastAsia="Calibri" w:hAnsi="Calibri"/>
@@ -67,7 +67,7 @@
         </w:rPr>
         <w:t xml:space="preserve">  ·  </w:t>
       </w:r>
-      <w:hyperlink w:history="1" r:id="rIdaml2p8jifjba2ngliobeh">
+      <w:hyperlink w:history="1" r:id="rIdwodbspqdw42nuee2ew0_w">
         <w:r>
           <w:rPr>
             <w:rFonts w:ascii="Calibri" w:cs="Calibri" w:eastAsia="Calibri" w:hAnsi="Calibri"/>
@@ -84,7 +84,7 @@
         </w:rPr>
         <w:t xml:space="preserve">  ·  </w:t>
       </w:r>
-      <w:hyperlink w:history="1" r:id="rIdte5emzir8onwwjoeevr2i">
+      <w:hyperlink w:history="1" r:id="rId86wqz9xrpn1hcvnze0kua">
         <w:r>
           <w:rPr>
             <w:rFonts w:ascii="Calibri" w:cs="Calibri" w:eastAsia="Calibri" w:hAnsi="Calibri"/>
@@ -101,7 +101,7 @@
         </w:rPr>
         <w:t xml:space="preserve">  ·  </w:t>
       </w:r>
-      <w:hyperlink w:history="1" r:id="rIdb3pw9xavjrobazkiiobuc">
+      <w:hyperlink w:history="1" r:id="rIdydyqhp0ds15cjbqzecl1u">
         <w:r>
           <w:rPr>
             <w:rFonts w:ascii="Calibri" w:cs="Calibri" w:eastAsia="Calibri" w:hAnsi="Calibri"/>
@@ -913,7 +913,7 @@
         </w:rPr>
         <w:t xml:space="preserve">  ·  </w:t>
       </w:r>
-      <w:hyperlink w:history="1" r:id="rIdicgxjlr6iq4qpdzzntykb">
+      <w:hyperlink w:history="1" r:id="rIdhox6bkaazwdhp1i_uxqeo">
         <w:r>
           <w:rPr>
             <w:rFonts w:ascii="Calibri" w:cs="Calibri" w:eastAsia="Calibri" w:hAnsi="Calibri"/>
@@ -970,7 +970,7 @@
         </w:rPr>
         <w:t xml:space="preserve">  ·  </w:t>
       </w:r>
-      <w:hyperlink w:history="1" r:id="rIdkpdz6bipcfavhnntcetks">
+      <w:hyperlink w:history="1" r:id="rIdkvcu8yytr4onlhwdrcgh6">
         <w:r>
           <w:rPr>
             <w:rFonts w:ascii="Calibri" w:cs="Calibri" w:eastAsia="Calibri" w:hAnsi="Calibri"/>
@@ -1027,7 +1027,7 @@
         </w:rPr>
         <w:t xml:space="preserve">  ·  </w:t>
       </w:r>
-      <w:hyperlink w:history="1" r:id="rIdegxmdmi9gqfbabho_edni">
+      <w:hyperlink w:history="1" r:id="rId_fkffynur2u9hz-zhk428">
         <w:r>
           <w:rPr>
             <w:rFonts w:ascii="Calibri" w:cs="Calibri" w:eastAsia="Calibri" w:hAnsi="Calibri"/>
@@ -1084,7 +1084,7 @@
         </w:rPr>
         <w:t xml:space="preserve">  ·  </w:t>
       </w:r>
-      <w:hyperlink w:history="1" r:id="rIdbjvwb7vmt0z59-yregs2d">
+      <w:hyperlink w:history="1" r:id="rIdxu09cp2faczgaun9oimbp">
         <w:r>
           <w:rPr>
             <w:rFonts w:ascii="Calibri" w:cs="Calibri" w:eastAsia="Calibri" w:hAnsi="Calibri"/>
@@ -1243,6 +1243,37 @@
           <w:szCs w:val="20"/>
         </w:rPr>
         <w:t xml:space="preserve"> — Scrum Alliance · Acquired 04/2016</w:t>
+      </w:r>
+    </w:p>
+    <w:p>
+      <w:pPr>
+        <w:pBdr>
+          <w:bottom w:val="single" w:color="CCC5B5" w:sz="4" w:space="2"/>
+        </w:pBdr>
+        <w:spacing w:after="80" w:before="220"/>
+      </w:pPr>
+      <w:r>
+        <w:rPr>
+          <w:rFonts w:ascii="Calibri" w:cs="Calibri" w:eastAsia="Calibri" w:hAnsi="Calibri"/>
+          <w:b/>
+          <w:bCs/>
+          <w:color w:val="A87A12"/>
+          <w:spacing w:val="30"/>
+          <w:sz w:val="19"/>
+          <w:szCs w:val="19"/>
+        </w:rPr>
+        <w:t xml:space="preserve">WORK PREFERENCE</w:t>
+      </w:r>
+    </w:p>
+    <w:p>
+      <w:r>
+        <w:rPr>
+          <w:rFonts w:ascii="Calibri" w:cs="Calibri" w:eastAsia="Calibri" w:hAnsi="Calibri"/>
+          <w:color w:val="1A1712"/>
+          <w:sz w:val="20"/>
+          <w:szCs w:val="20"/>
+        </w:rPr>
+        <w:t xml:space="preserve">Remote only. Not open to on-site or hybrid roles. Location is listed for reference.</w:t>
       </w:r>
     </w:p>
     <w:sectPr>
@@ -1255,6 +1286,10 @@
 </w:document>
 </file>
 
+<file path=word/comments.xml><?xml version="1.0" encoding="utf-8"?>
+<w:comments xmlns:cx="http://schemas.microsoft.com/office/drawing/2014/chartex" xmlns:cx1="http://schemas.microsoft.com/office/drawing/2015/9/8/chartex" xmlns:cx2="http://schemas.microsoft.com/office/drawing/2015/10/21/chartex" xmlns:cx3="http://schemas.microsoft.com/office/drawing/2016/5/9/chartex" xmlns:cx4="http://schemas.microsoft.com/office/drawing/2016/5/10/chartex" xmlns:cx5="http://schemas.microsoft.com/office/drawing/2016/5/11/chartex" xmlns:cx6="http://schemas.microsoft.com/office/drawing/2016/5/12/chartex" xmlns:cx7="http://schemas.microsoft.com/office/drawing/2016/5/13/chartex" xmlns:cx8="http://schemas.microsoft.com/office/drawing/2016/5/14/chartex" xmlns:mc="http://schemas.openxmlformats.org/markup-compatibility/2006" xmlns:aink="http://schemas.microsoft.com/office/drawing/2016/ink" xmlns:am3d="http://schemas.microsoft.com/office/drawing/2017/model3d" xmlns:o="urn:schemas-microsoft-com:office:office" xmlns:r="http://schemas.openxmlformats.org/officeDocument/2006/relationships" xmlns:m="http://schemas.openxmlformats.org/officeDocument/2006/math" xmlns:v="urn:schemas-microsoft-com:vml" xmlns:wp14="http://schemas.microsoft.com/office/word/2010/wordprocessingDrawing" xmlns:wp="http://schemas.openxmlformats.org/drawingml/2006/wordprocessingDrawing" xmlns:w10="urn:schemas-microsoft-com:office:word" xmlns:w="http://schemas.openxmlformats.org/wordprocessingml/2006/main" xmlns:w14="http://schemas.microsoft.com/office/word/2010/wordml" xmlns:w15="http://schemas.microsoft.com/office/word/2012/wordml" xmlns:w16cex="http://schemas.microsoft.com/office/word/2018/wordml/cex" xmlns:w16cid="http://schemas.microsoft.com/office/word/2016/wordml/cid" xmlns:w16="http://schemas.microsoft.com/office/word/2018/wordml" xmlns:w16sdtdh="http://schemas.microsoft.com/office/word/2020/wordml/sdtdatahash" xmlns:w16se="http://schemas.microsoft.com/office/word/2015/wordml/symex" xmlns:wpg="http://schemas.microsoft.com/office/word/2010/wordprocessingGroup" xmlns:wpi="http://schemas.microsoft.com/office/word/2010/wordprocessingInk" xmlns:wne="http://schemas.microsoft.com/office/word/2006/wordml" xmlns:wps="http://schemas.microsoft.com/office/word/2010/wordprocessingShape"/>
+</file>
+
 <file path=word/endnotes.xml><?xml version="1.0" encoding="utf-8"?>
 <w:endnotes xmlns:wpc="http://schemas.microsoft.com/office/word/2010/wordprocessingCanvas" xmlns:mc="http://schemas.openxmlformats.org/markup-compatibility/2006" xmlns:o="urn:schemas-microsoft-com:office:office" xmlns:r="http://schemas.openxmlformats.org/officeDocument/2006/relationships" xmlns:m="http://schemas.openxmlformats.org/officeDocument/2006/math" xmlns:v="urn:schemas-microsoft-com:vml" xmlns:wp14="http://schemas.microsoft.com/office/word/2010/wordprocessingDrawing" xmlns:wp="http://schemas.openxmlformats.org/drawingml/2006/wordprocessingDrawing" xmlns:w10="urn:schemas-microsoft-com:office:word" xmlns:w="http://schemas.openxmlformats.org/wordprocessingml/2006/main" xmlns:w14="http://schemas.microsoft.com/office/word/2010/wordml" xmlns:w15="http://schemas.microsoft.com/office/word/2012/wordml" xmlns:wpg="http://schemas.microsoft.com/office/word/2010/wordprocessingGroup" xmlns:wpi="http://schemas.microsoft.com/office/word/2010/wordprocessingInk" xmlns:wne="http://schemas.microsoft.com/office/word/2006/wordml" xmlns:wps="http://schemas.microsoft.com/office/word/2010/wordprocessingShape" mc:Ignorable="w14 w15 wp14">
   <w:endnote w:type="separator" w:id="-1">
@@ -1333,7 +1368,7 @@
 <w:numbering xmlns:wpc="http://schemas.microsoft.com/office/word/2010/wordprocessingCanvas" xmlns:mc="http://schemas.openxmlformats.org/markup-compatibility/2006" xmlns:o="urn:schemas-microsoft-com:office:office" xmlns:r="http://schemas.openxmlformats.org/officeDocument/2006/relationships" xmlns:m="http://schemas.openxmlformats.org/officeDocument/2006/math" xmlns:v="urn:schemas-microsoft-com:vml" xmlns:wp14="http://schemas.microsoft.com/office/word/2010/wordprocessingDrawing" xmlns:wp="http://schemas.openxmlformats.org/drawingml/2006/wordprocessingDrawing" xmlns:w10="urn:schemas-microsoft-com:office:word" xmlns:w="http://schemas.openxmlformats.org/wordprocessingml/2006/main" xmlns:w14="http://schemas.microsoft.com/office/word/2010/wordml" xmlns:w15="http://schemas.microsoft.com/office/word/2012/wordml" xmlns:wpg="http://schemas.microsoft.com/office/word/2010/wordprocessingGroup" xmlns:wpi="http://schemas.microsoft.com/office/word/2010/wordprocessingInk" xmlns:wne="http://schemas.microsoft.com/office/word/2006/wordml" xmlns:wps="http://schemas.microsoft.com/office/word/2010/wordprocessingShape" mc:Ignorable="w14 w15 wp14">
   <w:abstractNum w:abstractNumId="1" w15:restartNumberingAfterBreak="0">
     <w:multiLevelType w:val="hybridMultilevel"/>
-    <w:lvl w:ilvl="0" w:tentative="1">
+    <w:lvl w:ilvl="0" w15:tentative="1">
       <w:start w:val="1"/>
       <w:numFmt w:val="bullet"/>
       <w:lvlText w:val="●"/>
@@ -1342,7 +1377,7 @@
         <w:ind w:left="720" w:hanging="360"/>
       </w:pPr>
     </w:lvl>
-    <w:lvl w:ilvl="1" w:tentative="1">
+    <w:lvl w:ilvl="1" w15:tentative="1">
       <w:start w:val="1"/>
       <w:numFmt w:val="bullet"/>
       <w:lvlText w:val="○"/>
@@ -1351,7 +1386,7 @@
         <w:ind w:left="1440" w:hanging="360"/>
       </w:pPr>
     </w:lvl>
-    <w:lvl w:ilvl="2" w:tentative="1">
+    <w:lvl w:ilvl="2" w15:tentative="1">
       <w:start w:val="1"/>
       <w:numFmt w:val="bullet"/>
       <w:lvlText w:val="■"/>
@@ -1360,7 +1395,7 @@
         <w:ind w:left="2160" w:hanging="360"/>
       </w:pPr>
     </w:lvl>
-    <w:lvl w:ilvl="3" w:tentative="1">
+    <w:lvl w:ilvl="3" w15:tentative="1">
       <w:start w:val="1"/>
       <w:numFmt w:val="bullet"/>
       <w:lvlText w:val="●"/>
@@ -1369,7 +1404,7 @@
         <w:ind w:left="2880" w:hanging="360"/>
       </w:pPr>
     </w:lvl>
-    <w:lvl w:ilvl="4" w:tentative="1">
+    <w:lvl w:ilvl="4" w15:tentative="1">
       <w:start w:val="1"/>
       <w:numFmt w:val="bullet"/>
       <w:lvlText w:val="○"/>
@@ -1378,7 +1413,7 @@
         <w:ind w:left="3600" w:hanging="360"/>
       </w:pPr>
     </w:lvl>
-    <w:lvl w:ilvl="5" w:tentative="1">
+    <w:lvl w:ilvl="5" w15:tentative="1">
       <w:start w:val="1"/>
       <w:numFmt w:val="bullet"/>
       <w:lvlText w:val="■"/>
@@ -1387,7 +1422,7 @@
         <w:ind w:left="4320" w:hanging="360"/>
       </w:pPr>
     </w:lvl>
-    <w:lvl w:ilvl="6" w:tentative="1">
+    <w:lvl w:ilvl="6" w15:tentative="1">
       <w:start w:val="1"/>
       <w:numFmt w:val="bullet"/>
       <w:lvlText w:val="●"/>
@@ -1396,7 +1431,7 @@
         <w:ind w:left="5040" w:hanging="360"/>
       </w:pPr>
     </w:lvl>
-    <w:lvl w:ilvl="7" w:tentative="1">
+    <w:lvl w:ilvl="7" w15:tentative="1">
       <w:start w:val="1"/>
       <w:numFmt w:val="bullet"/>
       <w:lvlText w:val="●"/>
@@ -1405,7 +1440,7 @@
         <w:ind w:left="5760" w:hanging="360"/>
       </w:pPr>
     </w:lvl>
-    <w:lvl w:ilvl="8" w:tentative="1">
+    <w:lvl w:ilvl="8" w15:tentative="1">
       <w:start w:val="1"/>
       <w:numFmt w:val="bullet"/>
       <w:lvlText w:val="●"/>
@@ -1417,7 +1452,7 @@
   </w:abstractNum>
   <w:abstractNum w:abstractNumId="2" w15:restartNumberingAfterBreak="0">
     <w:multiLevelType w:val="hybridMultilevel"/>
-    <w:lvl w:ilvl="0" w:tentative="1">
+    <w:lvl w:ilvl="0" w15:tentative="1">
       <w:start w:val="1"/>
       <w:numFmt w:val="bullet"/>
       <w:lvlText w:val="•"/>
@@ -1455,10 +1490,6 @@
     </w:rPrDefault>
     <w:pPrDefault/>
   </w:docDefaults>
-  <w:style w:type="paragraph" w:styleId="Normal" w:default="1">
-    <w:name w:val="Normal"/>
-    <w:qFormat/>
-  </w:style>
   <w:style w:type="paragraph" w:styleId="Title">
     <w:name w:val="Title"/>
     <w:basedOn w:val="Normal"/>
@@ -1631,294 +1662,4 @@
     </w:rPr>
   </w:style>
 </w:styles>
-</file>
-
-<file path=word/theme/theme1.xml><?xml version="1.0" encoding="utf-8"?>
-<a:theme xmlns:a="http://schemas.openxmlformats.org/drawingml/2006/main" name="Office Theme">
-  <a:themeElements>
-    <a:clrScheme name="Office">
-      <a:dk1>
-        <a:sysClr val="windowText" lastClr="000000"/>
-      </a:dk1>
-      <a:lt1>
-        <a:sysClr val="window" lastClr="FFFFFF"/>
-      </a:lt1>
-      <a:dk2>
-        <a:srgbClr val="44546A"/>
-      </a:dk2>
-      <a:lt2>
-        <a:srgbClr val="E7E6E6"/>
-      </a:lt2>
-      <a:accent1>
-        <a:srgbClr val="4472C4"/>
-      </a:accent1>
-      <a:accent2>
-        <a:srgbClr val="ED7D31"/>
-      </a:accent2>
-      <a:accent3>
-        <a:srgbClr val="A5A5A5"/>
-      </a:accent3>
-      <a:accent4>
-        <a:srgbClr val="FFC000"/>
-      </a:accent4>
-      <a:accent5>
-        <a:srgbClr val="5B9BD5"/>
-      </a:accent5>
-      <a:accent6>
-        <a:srgbClr val="70AD47"/>
-      </a:accent6>
-      <a:hlink>
-        <a:srgbClr val="0563C1"/>
-      </a:hlink>
-      <a:folHlink>
-        <a:srgbClr val="954F72"/>
-      </a:folHlink>
-    </a:clrScheme>
-    <a:fontScheme name="Office">
-      <a:majorFont>
-        <a:latin typeface="Calibri Light" panose="020F0302020204030204"/>
-        <a:ea typeface=""/>
-        <a:cs typeface=""/>
-        <a:font script="Jpan" typeface="游ゴシック Light"/>
-        <a:font script="Hang" typeface="맑은 고딕"/>
-        <a:font script="Hans" typeface="等线 Light"/>
-        <a:font script="Hant" typeface="新細明體"/>
-        <a:font script="Arab" typeface="Times New Roman"/>
-        <a:font script="Hebr" typeface="Times New Roman"/>
-        <a:font script="Thai" typeface="Angsana New"/>
-        <a:font script="Ethi" typeface="Nyala"/>
-        <a:font script="Beng" typeface="Vrinda"/>
-        <a:font script="Gujr" typeface="Shruti"/>
-        <a:font script="Khmr" typeface="MoolBoran"/>
-        <a:font script="Knda" typeface="Tunga"/>
-        <a:font script="Guru" typeface="Raavi"/>
-        <a:font script="Cans" typeface="Euphemia"/>
-        <a:font script="Cher" typeface="Plantagenet Cherokee"/>
-        <a:font script="Yiii" typeface="Microsoft Yi Baiti"/>
-        <a:font script="Tibt" typeface="Microsoft Himalaya"/>
-        <a:font script="Thaa" typeface="MV Boli"/>
-        <a:font script="Deva" typeface="Mangal"/>
-        <a:font script="Telu" typeface="Gautami"/>
-        <a:font script="Taml" typeface="Latha"/>
-        <a:font script="Syrc" typeface="Estrangelo Edessa"/>
-        <a:font script="Orya" typeface="Kalinga"/>
-        <a:font script="Mlym" typeface="Kartika"/>
-        <a:font script="Laoo" typeface="DokChampa"/>
-        <a:font script="Sinh" typeface="Iskoola Pota"/>
-        <a:font script="Mong" typeface="Mongolian Baiti"/>
-        <a:font script="Viet" typeface="Times New Roman"/>
-        <a:font script="Uigh" typeface="Microsoft Uighur"/>
-        <a:font script="Geor" typeface="Sylfaen"/>
-        <a:font script="Armn" typeface="Arial"/>
-        <a:font script="Bugi" typeface="Leelawadee UI"/>
-        <a:font script="Bopo" typeface="Microsoft JhengHei"/>
-        <a:font script="Java" typeface="Javanese Text"/>
-        <a:font script="Lisu" typeface="Segoe UI"/>
-        <a:font script="Mymr" typeface="Myanmar Text"/>
-        <a:font script="Nkoo" typeface="Ebrima"/>
-        <a:font script="Olck" typeface="Nirmala UI"/>
-        <a:font script="Osma" typeface="Ebrima"/>
-        <a:font script="Phag" typeface="Phagspa"/>
-        <a:font script="Syrn" typeface="Estrangelo Edessa"/>
-        <a:font script="Syrj" typeface="Estrangelo Edessa"/>
-        <a:font script="Syre" typeface="Estrangelo Edessa"/>
-        <a:font script="Sora" typeface="Nirmala UI"/>
-        <a:font script="Tale" typeface="Microsoft Tai Le"/>
-        <a:font script="Talu" typeface="Microsoft New Tai Lue"/>
-        <a:font script="Tfng" typeface="Ebrima"/>
-      </a:majorFont>
-      <a:minorFont>
-        <a:latin typeface="Calibri" panose="020F0502020204030204"/>
-        <a:ea typeface=""/>
-        <a:cs typeface=""/>
-        <a:font script="Jpan" typeface="游明朝"/>
-        <a:font script="Hang" typeface="맑은 고딕"/>
-        <a:font script="Hans" typeface="等线"/>
-        <a:font script="Hant" typeface="新細明體"/>
-        <a:font script="Arab" typeface="Arial"/>
-        <a:font script="Hebr" typeface="Arial"/>
-        <a:font script="Thai" typeface="Cordia New"/>
-        <a:font script="Ethi" typeface="Nyala"/>
-        <a:font script="Beng" typeface="Vrinda"/>
-        <a:font script="Gujr" typeface="Shruti"/>
-        <a:font script="Khmr" typeface="DaunPenh"/>
-        <a:font script="Knda" typeface="Tunga"/>
-        <a:font script="Guru" typeface="Raavi"/>
-        <a:font script="Cans" typeface="Euphemia"/>
-        <a:font script="Cher" typeface="Plantagenet Cherokee"/>
-        <a:font script="Yiii" typeface="Microsoft Yi Baiti"/>
-        <a:font script="Tibt" typeface="Microsoft Himalaya"/>
-        <a:font script="Thaa" typeface="MV Boli"/>
-        <a:font script="Deva" typeface="Mangal"/>
-        <a:font script="Telu" typeface="Gautami"/>
-        <a:font script="Taml" typeface="Latha"/>
-        <a:font script="Syrc" typeface="Estrangelo Edessa"/>
-        <a:font script="Orya" typeface="Kalinga"/>
-        <a:font script="Mlym" typeface="Kartika"/>
-        <a:font script="Laoo" typeface="DokChampa"/>
-        <a:font script="Sinh" typeface="Iskoola Pota"/>
-        <a:font script="Mong" typeface="Mongolian Baiti"/>
-        <a:font script="Viet" typeface="Arial"/>
-        <a:font script="Uigh" typeface="Microsoft Uighur"/>
-        <a:font script="Geor" typeface="Sylfaen"/>
-        <a:font script="Armn" typeface="Arial"/>
-        <a:font script="Bugi" typeface="Leelawadee UI"/>
-        <a:font script="Bopo" typeface="Microsoft JhengHei"/>
-        <a:font script="Java" typeface="Javanese Text"/>
-        <a:font script="Lisu" typeface="Segoe UI"/>
-        <a:font script="Mymr" typeface="Myanmar Text"/>
-        <a:font script="Nkoo" typeface="Ebrima"/>
-        <a:font script="Olck" typeface="Nirmala UI"/>
-        <a:font script="Osma" typeface="Ebrima"/>
-        <a:font script="Phag" typeface="Phagspa"/>
-        <a:font script="Syrn" typeface="Estrangelo Edessa"/>
-        <a:font script="Syrj" typeface="Estrangelo Edessa"/>
-        <a:font script="Syre" typeface="Estrangelo Edessa"/>
-        <a:font script="Sora" typeface="Nirmala UI"/>
-        <a:font script="Tale" typeface="Microsoft Tai Le"/>
-        <a:font script="Talu" typeface="Microsoft New Tai Lue"/>
-        <a:font script="Tfng" typeface="Ebrima"/>
-      </a:minorFont>
-    </a:fontScheme>
-    <a:fmtScheme name="Office">
-      <a:fillStyleLst>
-        <a:solidFill>
-          <a:schemeClr val="phClr"/>
-        </a:solidFill>
-        <a:gradFill rotWithShape="true">
-          <a:gsLst>
-            <a:gs pos="0">
-              <a:schemeClr val="phClr">
-                <a:lumMod val="110000"/>
-                <a:satMod val="105000"/>
-                <a:tint val="67000"/>
-              </a:schemeClr>
-            </a:gs>
-            <a:gs pos="50000">
-              <a:schemeClr val="phClr">
-                <a:lumMod val="105000"/>
-                <a:satMod val="103000"/>
-                <a:tint val="73000"/>
-              </a:schemeClr>
-            </a:gs>
-            <a:gs pos="100000">
-              <a:schemeClr val="phClr">
-                <a:lumMod val="105000"/>
-                <a:satMod val="109000"/>
-                <a:tint val="81000"/>
-              </a:schemeClr>
-            </a:gs>
-          </a:gsLst>
-          <a:lin ang="5400000" scaled="false"/>
-        </a:gradFill>
-        <a:gradFill rotWithShape="true">
-          <a:gsLst>
-            <a:gs pos="0">
-              <a:schemeClr val="phClr">
-                <a:satMod val="103000"/>
-                <a:lumMod val="102000"/>
-                <a:tint val="94000"/>
-              </a:schemeClr>
-            </a:gs>
-            <a:gs pos="50000">
-              <a:schemeClr val="phClr">
-                <a:satMod val="110000"/>
-                <a:lumMod val="100000"/>
-                <a:shade val="100000"/>
-              </a:schemeClr>
-            </a:gs>
-            <a:gs pos="100000">
-              <a:schemeClr val="phClr">
-                <a:lumMod val="99000"/>
-                <a:satMod val="120000"/>
-                <a:shade val="78000"/>
-              </a:schemeClr>
-            </a:gs>
-          </a:gsLst>
-          <a:lin ang="5400000" scaled="false"/>
-        </a:gradFill>
-      </a:fillStyleLst>
-      <a:lnStyleLst>
-        <a:ln w="6350" cap="flat" cmpd="sng" algn="ctr">
-          <a:solidFill>
-            <a:schemeClr val="phClr"/>
-          </a:solidFill>
-          <a:prstDash val="solid"/>
-          <a:miter lim="800000"/>
-        </a:ln>
-        <a:ln w="12700" cap="flat" cmpd="sng" algn="ctr">
-          <a:solidFill>
-            <a:schemeClr val="phClr"/>
-          </a:solidFill>
-          <a:prstDash val="solid"/>
-          <a:miter lim="800000"/>
-        </a:ln>
-        <a:ln w="19050" cap="flat" cmpd="sng" algn="ctr">
-          <a:solidFill>
-            <a:schemeClr val="phClr"/>
-          </a:solidFill>
-          <a:prstDash val="solid"/>
-          <a:miter lim="800000"/>
-        </a:ln>
-      </a:lnStyleLst>
-      <a:effectStyleLst>
-        <a:effectStyle>
-          <a:effectLst/>
-        </a:effectStyle>
-        <a:effectStyle>
-          <a:effectLst/>
-        </a:effectStyle>
-        <a:effectStyle>
-          <a:effectLst>
-            <a:outerShdw blurRad="57150" dist="19050" dir="5400000" algn="ctr" rotWithShape="false">
-              <a:srgbClr val="000000">
-                <a:alpha val="63000"/>
-              </a:srgbClr>
-            </a:outerShdw>
-          </a:effectLst>
-        </a:effectStyle>
-      </a:effectStyleLst>
-      <a:bgFillStyleLst>
-        <a:solidFill>
-          <a:schemeClr val="phClr"/>
-        </a:solidFill>
-        <a:solidFill>
-          <a:schemeClr val="phClr">
-            <a:tint val="95000"/>
-            <a:satMod val="170000"/>
-          </a:schemeClr>
-        </a:solidFill>
-        <a:gradFill rotWithShape="true">
-          <a:gsLst>
-            <a:gs pos="0">
-              <a:schemeClr val="phClr">
-                <a:tint val="93000"/>
-                <a:satMod val="150000"/>
-                <a:shade val="98000"/>
-                <a:lumMod val="102000"/>
-              </a:schemeClr>
-            </a:gs>
-            <a:gs pos="50000">
-              <a:schemeClr val="phClr">
-                <a:tint val="98000"/>
-                <a:satMod val="130000"/>
-                <a:shade val="90000"/>
-                <a:lumMod val="103000"/>
-              </a:schemeClr>
-            </a:gs>
-            <a:gs pos="100000">
-              <a:schemeClr val="phClr">
-                <a:shade val="63000"/>
-                <a:satMod val="120000"/>
-              </a:schemeClr>
-            </a:gs>
-          </a:gsLst>
-          <a:lin ang="5400000" scaled="false"/>
-        </a:gradFill>
-      </a:bgFillStyleLst>
-    </a:fmtScheme>
-  </a:themeElements>
-  <a:objectDefaults/>
-  <a:extraClrSchemeLst/>
-</a:theme>
 </file>
</xml_diff>

<commit_message>
Update resume site, PDF and DOCX
</commit_message>
<xml_diff>
--- a/resume/Tory-Hebert-Resume.docx
+++ b/resume/Tory-Hebert-Resume.docx
@@ -50,7 +50,7 @@
         </w:rPr>
         <w:t xml:space="preserve">  ·  </w:t>
       </w:r>
-      <w:hyperlink w:history="1" r:id="rIdkvr_x48wn5_a3fo8aorj0">
+      <w:hyperlink w:history="1" r:id="rIdh3n13efzkul_fyjjc2cj4">
         <w:r>
           <w:rPr>
             <w:rFonts w:ascii="Calibri" w:cs="Calibri" w:eastAsia="Calibri" w:hAnsi="Calibri"/>
@@ -67,7 +67,7 @@
         </w:rPr>
         <w:t xml:space="preserve">  ·  </w:t>
       </w:r>
-      <w:hyperlink w:history="1" r:id="rIdwodbspqdw42nuee2ew0_w">
+      <w:hyperlink w:history="1" r:id="rIdnahsk1twxh10yl_lwprq-">
         <w:r>
           <w:rPr>
             <w:rFonts w:ascii="Calibri" w:cs="Calibri" w:eastAsia="Calibri" w:hAnsi="Calibri"/>
@@ -84,7 +84,7 @@
         </w:rPr>
         <w:t xml:space="preserve">  ·  </w:t>
       </w:r>
-      <w:hyperlink w:history="1" r:id="rId86wqz9xrpn1hcvnze0kua">
+      <w:hyperlink w:history="1" r:id="rIdctwqpxgbkln6h9awdt0do">
         <w:r>
           <w:rPr>
             <w:rFonts w:ascii="Calibri" w:cs="Calibri" w:eastAsia="Calibri" w:hAnsi="Calibri"/>
@@ -101,7 +101,7 @@
         </w:rPr>
         <w:t xml:space="preserve">  ·  </w:t>
       </w:r>
-      <w:hyperlink w:history="1" r:id="rIdydyqhp0ds15cjbqzecl1u">
+      <w:hyperlink w:history="1" r:id="rId5hiqnpliy8jyqtk-_fxcp">
         <w:r>
           <w:rPr>
             <w:rFonts w:ascii="Calibri" w:cs="Calibri" w:eastAsia="Calibri" w:hAnsi="Calibri"/>
@@ -469,7 +469,7 @@
           <w:sz w:val="20"/>
           <w:szCs w:val="20"/>
         </w:rPr>
-        <w:t xml:space="preserve">Work through AI agents every day to plan, build, test and debug, including an org-wide agent-tooling and MCP-integration stack for production debugging.</w:t>
+        <w:t xml:space="preserve">Work through AI agents every day to plan, build, test and debug, and debug production through the company's MCP-connected agent tooling.</w:t>
       </w:r>
     </w:p>
     <w:p>
@@ -913,7 +913,7 @@
         </w:rPr>
         <w:t xml:space="preserve">  ·  </w:t>
       </w:r>
-      <w:hyperlink w:history="1" r:id="rIdhox6bkaazwdhp1i_uxqeo">
+      <w:hyperlink w:history="1" r:id="rId6vvj7qgabux3oso7vlbwu">
         <w:r>
           <w:rPr>
             <w:rFonts w:ascii="Calibri" w:cs="Calibri" w:eastAsia="Calibri" w:hAnsi="Calibri"/>
@@ -970,7 +970,7 @@
         </w:rPr>
         <w:t xml:space="preserve">  ·  </w:t>
       </w:r>
-      <w:hyperlink w:history="1" r:id="rIdkvcu8yytr4onlhwdrcgh6">
+      <w:hyperlink w:history="1" r:id="rIdmtcm2e9geje5tni2pgbdm">
         <w:r>
           <w:rPr>
             <w:rFonts w:ascii="Calibri" w:cs="Calibri" w:eastAsia="Calibri" w:hAnsi="Calibri"/>
@@ -1027,7 +1027,7 @@
         </w:rPr>
         <w:t xml:space="preserve">  ·  </w:t>
       </w:r>
-      <w:hyperlink w:history="1" r:id="rId_fkffynur2u9hz-zhk428">
+      <w:hyperlink w:history="1" r:id="rIdwyli7wuqd8ou5l3le05xm">
         <w:r>
           <w:rPr>
             <w:rFonts w:ascii="Calibri" w:cs="Calibri" w:eastAsia="Calibri" w:hAnsi="Calibri"/>
@@ -1084,7 +1084,7 @@
         </w:rPr>
         <w:t xml:space="preserve">  ·  </w:t>
       </w:r>
-      <w:hyperlink w:history="1" r:id="rIdxu09cp2faczgaun9oimbp">
+      <w:hyperlink w:history="1" r:id="rIdyqumqwdc1e2r7ox16es1o">
         <w:r>
           <w:rPr>
             <w:rFonts w:ascii="Calibri" w:cs="Calibri" w:eastAsia="Calibri" w:hAnsi="Calibri"/>
@@ -1092,6 +1092,63 @@
             <w:u w:val="single"/>
           </w:rPr>
           <w:t xml:space="preserve">github.com/tory37/djaunt-browser-tools</w:t>
+        </w:r>
+      </w:hyperlink>
+    </w:p>
+    <w:p>
+      <w:pPr>
+        <w:keepNext/>
+        <w:spacing w:after="0" w:before="60"/>
+      </w:pPr>
+      <w:r>
+        <w:rPr>
+          <w:rFonts w:ascii="Calibri" w:cs="Calibri" w:eastAsia="Calibri" w:hAnsi="Calibri"/>
+          <w:b/>
+          <w:bCs/>
+          <w:color w:val="1A1712"/>
+          <w:sz w:val="20"/>
+          <w:szCs w:val="20"/>
+        </w:rPr>
+        <w:t xml:space="preserve">djaunt-agent-hubs</w:t>
+      </w:r>
+      <w:r>
+        <w:rPr>
+          <w:rFonts w:ascii="Calibri" w:cs="Calibri" w:eastAsia="Calibri" w:hAnsi="Calibri"/>
+          <w:color w:val="1A1712"/>
+          <w:sz w:val="20"/>
+          <w:szCs w:val="20"/>
+        </w:rPr>
+        <w:t xml:space="preserve"> — A local daemon that hosts live browser hubs for agents (djt-hub).</w:t>
+      </w:r>
+    </w:p>
+    <w:p>
+      <w:pPr>
+        <w:spacing w:after="40"/>
+      </w:pPr>
+      <w:r>
+        <w:rPr>
+          <w:rFonts w:ascii="Calibri" w:cs="Calibri" w:eastAsia="Calibri" w:hAnsi="Calibri"/>
+          <w:color w:val="5A554C"/>
+          <w:sz w:val="18"/>
+          <w:szCs w:val="18"/>
+        </w:rPr>
+        <w:t xml:space="preserve">Go · SQLite · JavaScript · launchd · Claude Code</w:t>
+      </w:r>
+      <w:r>
+        <w:rPr>
+          <w:rFonts w:ascii="Calibri" w:cs="Calibri" w:eastAsia="Calibri" w:hAnsi="Calibri"/>
+          <w:color w:val="5A554C"/>
+        </w:rPr>
+        <w:t xml:space="preserve">  ·  </w:t>
+      </w:r>
+      <w:hyperlink w:history="1" r:id="rId5x_evhzfq9sopuh24b7u0">
+        <w:r>
+          <w:rPr>
+            <w:rFonts w:ascii="Calibri" w:cs="Calibri" w:eastAsia="Calibri" w:hAnsi="Calibri"/>
+            <w:color w:val="1A1712"/>
+            <w:u w:val="single"/>
+          </w:rPr>
+          <w:t xml:space="preserve">github.com/tory37/djaunt-agent-hubs</w:t>
         </w:r>
       </w:hyperlink>
     </w:p>
@@ -1286,10 +1343,6 @@
 </w:document>
 </file>
 
-<file path=word/comments.xml><?xml version="1.0" encoding="utf-8"?>
-<w:comments xmlns:cx="http://schemas.microsoft.com/office/drawing/2014/chartex" xmlns:cx1="http://schemas.microsoft.com/office/drawing/2015/9/8/chartex" xmlns:cx2="http://schemas.microsoft.com/office/drawing/2015/10/21/chartex" xmlns:cx3="http://schemas.microsoft.com/office/drawing/2016/5/9/chartex" xmlns:cx4="http://schemas.microsoft.com/office/drawing/2016/5/10/chartex" xmlns:cx5="http://schemas.microsoft.com/office/drawing/2016/5/11/chartex" xmlns:cx6="http://schemas.microsoft.com/office/drawing/2016/5/12/chartex" xmlns:cx7="http://schemas.microsoft.com/office/drawing/2016/5/13/chartex" xmlns:cx8="http://schemas.microsoft.com/office/drawing/2016/5/14/chartex" xmlns:mc="http://schemas.openxmlformats.org/markup-compatibility/2006" xmlns:aink="http://schemas.microsoft.com/office/drawing/2016/ink" xmlns:am3d="http://schemas.microsoft.com/office/drawing/2017/model3d" xmlns:o="urn:schemas-microsoft-com:office:office" xmlns:r="http://schemas.openxmlformats.org/officeDocument/2006/relationships" xmlns:m="http://schemas.openxmlformats.org/officeDocument/2006/math" xmlns:v="urn:schemas-microsoft-com:vml" xmlns:wp14="http://schemas.microsoft.com/office/word/2010/wordprocessingDrawing" xmlns:wp="http://schemas.openxmlformats.org/drawingml/2006/wordprocessingDrawing" xmlns:w10="urn:schemas-microsoft-com:office:word" xmlns:w="http://schemas.openxmlformats.org/wordprocessingml/2006/main" xmlns:w14="http://schemas.microsoft.com/office/word/2010/wordml" xmlns:w15="http://schemas.microsoft.com/office/word/2012/wordml" xmlns:w16cex="http://schemas.microsoft.com/office/word/2018/wordml/cex" xmlns:w16cid="http://schemas.microsoft.com/office/word/2016/wordml/cid" xmlns:w16="http://schemas.microsoft.com/office/word/2018/wordml" xmlns:w16sdtdh="http://schemas.microsoft.com/office/word/2020/wordml/sdtdatahash" xmlns:w16se="http://schemas.microsoft.com/office/word/2015/wordml/symex" xmlns:wpg="http://schemas.microsoft.com/office/word/2010/wordprocessingGroup" xmlns:wpi="http://schemas.microsoft.com/office/word/2010/wordprocessingInk" xmlns:wne="http://schemas.microsoft.com/office/word/2006/wordml" xmlns:wps="http://schemas.microsoft.com/office/word/2010/wordprocessingShape"/>
-</file>
-
 <file path=word/endnotes.xml><?xml version="1.0" encoding="utf-8"?>
 <w:endnotes xmlns:wpc="http://schemas.microsoft.com/office/word/2010/wordprocessingCanvas" xmlns:mc="http://schemas.openxmlformats.org/markup-compatibility/2006" xmlns:o="urn:schemas-microsoft-com:office:office" xmlns:r="http://schemas.openxmlformats.org/officeDocument/2006/relationships" xmlns:m="http://schemas.openxmlformats.org/officeDocument/2006/math" xmlns:v="urn:schemas-microsoft-com:vml" xmlns:wp14="http://schemas.microsoft.com/office/word/2010/wordprocessingDrawing" xmlns:wp="http://schemas.openxmlformats.org/drawingml/2006/wordprocessingDrawing" xmlns:w10="urn:schemas-microsoft-com:office:word" xmlns:w="http://schemas.openxmlformats.org/wordprocessingml/2006/main" xmlns:w14="http://schemas.microsoft.com/office/word/2010/wordml" xmlns:w15="http://schemas.microsoft.com/office/word/2012/wordml" xmlns:wpg="http://schemas.microsoft.com/office/word/2010/wordprocessingGroup" xmlns:wpi="http://schemas.microsoft.com/office/word/2010/wordprocessingInk" xmlns:wne="http://schemas.microsoft.com/office/word/2006/wordml" xmlns:wps="http://schemas.microsoft.com/office/word/2010/wordprocessingShape" mc:Ignorable="w14 w15 wp14">
   <w:endnote w:type="separator" w:id="-1">
@@ -1368,7 +1421,7 @@
 <w:numbering xmlns:wpc="http://schemas.microsoft.com/office/word/2010/wordprocessingCanvas" xmlns:mc="http://schemas.openxmlformats.org/markup-compatibility/2006" xmlns:o="urn:schemas-microsoft-com:office:office" xmlns:r="http://schemas.openxmlformats.org/officeDocument/2006/relationships" xmlns:m="http://schemas.openxmlformats.org/officeDocument/2006/math" xmlns:v="urn:schemas-microsoft-com:vml" xmlns:wp14="http://schemas.microsoft.com/office/word/2010/wordprocessingDrawing" xmlns:wp="http://schemas.openxmlformats.org/drawingml/2006/wordprocessingDrawing" xmlns:w10="urn:schemas-microsoft-com:office:word" xmlns:w="http://schemas.openxmlformats.org/wordprocessingml/2006/main" xmlns:w14="http://schemas.microsoft.com/office/word/2010/wordml" xmlns:w15="http://schemas.microsoft.com/office/word/2012/wordml" xmlns:wpg="http://schemas.microsoft.com/office/word/2010/wordprocessingGroup" xmlns:wpi="http://schemas.microsoft.com/office/word/2010/wordprocessingInk" xmlns:wne="http://schemas.microsoft.com/office/word/2006/wordml" xmlns:wps="http://schemas.microsoft.com/office/word/2010/wordprocessingShape" mc:Ignorable="w14 w15 wp14">
   <w:abstractNum w:abstractNumId="1" w15:restartNumberingAfterBreak="0">
     <w:multiLevelType w:val="hybridMultilevel"/>
-    <w:lvl w:ilvl="0" w15:tentative="1">
+    <w:lvl w:ilvl="0" w:tentative="1">
       <w:start w:val="1"/>
       <w:numFmt w:val="bullet"/>
       <w:lvlText w:val="●"/>
@@ -1377,7 +1430,7 @@
         <w:ind w:left="720" w:hanging="360"/>
       </w:pPr>
     </w:lvl>
-    <w:lvl w:ilvl="1" w15:tentative="1">
+    <w:lvl w:ilvl="1" w:tentative="1">
       <w:start w:val="1"/>
       <w:numFmt w:val="bullet"/>
       <w:lvlText w:val="○"/>
@@ -1386,7 +1439,7 @@
         <w:ind w:left="1440" w:hanging="360"/>
       </w:pPr>
     </w:lvl>
-    <w:lvl w:ilvl="2" w15:tentative="1">
+    <w:lvl w:ilvl="2" w:tentative="1">
       <w:start w:val="1"/>
       <w:numFmt w:val="bullet"/>
       <w:lvlText w:val="■"/>
@@ -1395,7 +1448,7 @@
         <w:ind w:left="2160" w:hanging="360"/>
       </w:pPr>
     </w:lvl>
-    <w:lvl w:ilvl="3" w15:tentative="1">
+    <w:lvl w:ilvl="3" w:tentative="1">
       <w:start w:val="1"/>
       <w:numFmt w:val="bullet"/>
       <w:lvlText w:val="●"/>
@@ -1404,7 +1457,7 @@
         <w:ind w:left="2880" w:hanging="360"/>
       </w:pPr>
     </w:lvl>
-    <w:lvl w:ilvl="4" w15:tentative="1">
+    <w:lvl w:ilvl="4" w:tentative="1">
       <w:start w:val="1"/>
       <w:numFmt w:val="bullet"/>
       <w:lvlText w:val="○"/>
@@ -1413,7 +1466,7 @@
         <w:ind w:left="3600" w:hanging="360"/>
       </w:pPr>
     </w:lvl>
-    <w:lvl w:ilvl="5" w15:tentative="1">
+    <w:lvl w:ilvl="5" w:tentative="1">
       <w:start w:val="1"/>
       <w:numFmt w:val="bullet"/>
       <w:lvlText w:val="■"/>
@@ -1422,7 +1475,7 @@
         <w:ind w:left="4320" w:hanging="360"/>
       </w:pPr>
     </w:lvl>
-    <w:lvl w:ilvl="6" w15:tentative="1">
+    <w:lvl w:ilvl="6" w:tentative="1">
       <w:start w:val="1"/>
       <w:numFmt w:val="bullet"/>
       <w:lvlText w:val="●"/>
@@ -1431,7 +1484,7 @@
         <w:ind w:left="5040" w:hanging="360"/>
       </w:pPr>
     </w:lvl>
-    <w:lvl w:ilvl="7" w15:tentative="1">
+    <w:lvl w:ilvl="7" w:tentative="1">
       <w:start w:val="1"/>
       <w:numFmt w:val="bullet"/>
       <w:lvlText w:val="●"/>
@@ -1440,7 +1493,7 @@
         <w:ind w:left="5760" w:hanging="360"/>
       </w:pPr>
     </w:lvl>
-    <w:lvl w:ilvl="8" w15:tentative="1">
+    <w:lvl w:ilvl="8" w:tentative="1">
       <w:start w:val="1"/>
       <w:numFmt w:val="bullet"/>
       <w:lvlText w:val="●"/>
@@ -1452,7 +1505,7 @@
   </w:abstractNum>
   <w:abstractNum w:abstractNumId="2" w15:restartNumberingAfterBreak="0">
     <w:multiLevelType w:val="hybridMultilevel"/>
-    <w:lvl w:ilvl="0" w15:tentative="1">
+    <w:lvl w:ilvl="0" w:tentative="1">
       <w:start w:val="1"/>
       <w:numFmt w:val="bullet"/>
       <w:lvlText w:val="•"/>
@@ -1490,6 +1543,25 @@
     </w:rPrDefault>
     <w:pPrDefault/>
   </w:docDefaults>
+  <w:style w:type="paragraph" w:styleId="Normal" w:default="1">
+    <w:name w:val="Normal"/>
+    <w:qFormat/>
+  </w:style>
+  <w:style w:type="table" w:styleId="TableNormal" w:default="true">
+    <w:name w:val="Normal Table"/>
+    <w:uiPriority w:val="99"/>
+    <w:semiHidden/>
+    <w:unhideWhenUsed/>
+    <w:tblPr>
+      <w:tblInd w:type="dxa" w:w="0"/>
+      <w:tblCellMar>
+        <w:top w:type="dxa" w:w="0"/>
+        <w:left w:type="dxa" w:w="108"/>
+        <w:bottom w:type="dxa" w:w="0"/>
+        <w:right w:type="dxa" w:w="108"/>
+      </w:tblCellMar>
+    </w:tblPr>
+  </w:style>
   <w:style w:type="paragraph" w:styleId="Title">
     <w:name w:val="Title"/>
     <w:basedOn w:val="Normal"/>
@@ -1662,4 +1734,294 @@
     </w:rPr>
   </w:style>
 </w:styles>
+</file>
+
+<file path=word/theme/theme1.xml><?xml version="1.0" encoding="utf-8"?>
+<a:theme xmlns:a="http://schemas.openxmlformats.org/drawingml/2006/main" name="Office Theme">
+  <a:themeElements>
+    <a:clrScheme name="Office">
+      <a:dk1>
+        <a:sysClr val="windowText" lastClr="000000"/>
+      </a:dk1>
+      <a:lt1>
+        <a:sysClr val="window" lastClr="FFFFFF"/>
+      </a:lt1>
+      <a:dk2>
+        <a:srgbClr val="44546A"/>
+      </a:dk2>
+      <a:lt2>
+        <a:srgbClr val="E7E6E6"/>
+      </a:lt2>
+      <a:accent1>
+        <a:srgbClr val="4472C4"/>
+      </a:accent1>
+      <a:accent2>
+        <a:srgbClr val="ED7D31"/>
+      </a:accent2>
+      <a:accent3>
+        <a:srgbClr val="A5A5A5"/>
+      </a:accent3>
+      <a:accent4>
+        <a:srgbClr val="FFC000"/>
+      </a:accent4>
+      <a:accent5>
+        <a:srgbClr val="5B9BD5"/>
+      </a:accent5>
+      <a:accent6>
+        <a:srgbClr val="70AD47"/>
+      </a:accent6>
+      <a:hlink>
+        <a:srgbClr val="0563C1"/>
+      </a:hlink>
+      <a:folHlink>
+        <a:srgbClr val="954F72"/>
+      </a:folHlink>
+    </a:clrScheme>
+    <a:fontScheme name="Office">
+      <a:majorFont>
+        <a:latin typeface="Calibri Light" panose="020F0302020204030204"/>
+        <a:ea typeface=""/>
+        <a:cs typeface=""/>
+        <a:font script="Jpan" typeface="游ゴシック Light"/>
+        <a:font script="Hang" typeface="맑은 고딕"/>
+        <a:font script="Hans" typeface="等线 Light"/>
+        <a:font script="Hant" typeface="新細明體"/>
+        <a:font script="Arab" typeface="Times New Roman"/>
+        <a:font script="Hebr" typeface="Times New Roman"/>
+        <a:font script="Thai" typeface="Angsana New"/>
+        <a:font script="Ethi" typeface="Nyala"/>
+        <a:font script="Beng" typeface="Vrinda"/>
+        <a:font script="Gujr" typeface="Shruti"/>
+        <a:font script="Khmr" typeface="MoolBoran"/>
+        <a:font script="Knda" typeface="Tunga"/>
+        <a:font script="Guru" typeface="Raavi"/>
+        <a:font script="Cans" typeface="Euphemia"/>
+        <a:font script="Cher" typeface="Plantagenet Cherokee"/>
+        <a:font script="Yiii" typeface="Microsoft Yi Baiti"/>
+        <a:font script="Tibt" typeface="Microsoft Himalaya"/>
+        <a:font script="Thaa" typeface="MV Boli"/>
+        <a:font script="Deva" typeface="Mangal"/>
+        <a:font script="Telu" typeface="Gautami"/>
+        <a:font script="Taml" typeface="Latha"/>
+        <a:font script="Syrc" typeface="Estrangelo Edessa"/>
+        <a:font script="Orya" typeface="Kalinga"/>
+        <a:font script="Mlym" typeface="Kartika"/>
+        <a:font script="Laoo" typeface="DokChampa"/>
+        <a:font script="Sinh" typeface="Iskoola Pota"/>
+        <a:font script="Mong" typeface="Mongolian Baiti"/>
+        <a:font script="Viet" typeface="Times New Roman"/>
+        <a:font script="Uigh" typeface="Microsoft Uighur"/>
+        <a:font script="Geor" typeface="Sylfaen"/>
+        <a:font script="Armn" typeface="Arial"/>
+        <a:font script="Bugi" typeface="Leelawadee UI"/>
+        <a:font script="Bopo" typeface="Microsoft JhengHei"/>
+        <a:font script="Java" typeface="Javanese Text"/>
+        <a:font script="Lisu" typeface="Segoe UI"/>
+        <a:font script="Mymr" typeface="Myanmar Text"/>
+        <a:font script="Nkoo" typeface="Ebrima"/>
+        <a:font script="Olck" typeface="Nirmala UI"/>
+        <a:font script="Osma" typeface="Ebrima"/>
+        <a:font script="Phag" typeface="Phagspa"/>
+        <a:font script="Syrn" typeface="Estrangelo Edessa"/>
+        <a:font script="Syrj" typeface="Estrangelo Edessa"/>
+        <a:font script="Syre" typeface="Estrangelo Edessa"/>
+        <a:font script="Sora" typeface="Nirmala UI"/>
+        <a:font script="Tale" typeface="Microsoft Tai Le"/>
+        <a:font script="Talu" typeface="Microsoft New Tai Lue"/>
+        <a:font script="Tfng" typeface="Ebrima"/>
+      </a:majorFont>
+      <a:minorFont>
+        <a:latin typeface="Calibri" panose="020F0502020204030204"/>
+        <a:ea typeface=""/>
+        <a:cs typeface=""/>
+        <a:font script="Jpan" typeface="游明朝"/>
+        <a:font script="Hang" typeface="맑은 고딕"/>
+        <a:font script="Hans" typeface="等线"/>
+        <a:font script="Hant" typeface="新細明體"/>
+        <a:font script="Arab" typeface="Arial"/>
+        <a:font script="Hebr" typeface="Arial"/>
+        <a:font script="Thai" typeface="Cordia New"/>
+        <a:font script="Ethi" typeface="Nyala"/>
+        <a:font script="Beng" typeface="Vrinda"/>
+        <a:font script="Gujr" typeface="Shruti"/>
+        <a:font script="Khmr" typeface="DaunPenh"/>
+        <a:font script="Knda" typeface="Tunga"/>
+        <a:font script="Guru" typeface="Raavi"/>
+        <a:font script="Cans" typeface="Euphemia"/>
+        <a:font script="Cher" typeface="Plantagenet Cherokee"/>
+        <a:font script="Yiii" typeface="Microsoft Yi Baiti"/>
+        <a:font script="Tibt" typeface="Microsoft Himalaya"/>
+        <a:font script="Thaa" typeface="MV Boli"/>
+        <a:font script="Deva" typeface="Mangal"/>
+        <a:font script="Telu" typeface="Gautami"/>
+        <a:font script="Taml" typeface="Latha"/>
+        <a:font script="Syrc" typeface="Estrangelo Edessa"/>
+        <a:font script="Orya" typeface="Kalinga"/>
+        <a:font script="Mlym" typeface="Kartika"/>
+        <a:font script="Laoo" typeface="DokChampa"/>
+        <a:font script="Sinh" typeface="Iskoola Pota"/>
+        <a:font script="Mong" typeface="Mongolian Baiti"/>
+        <a:font script="Viet" typeface="Arial"/>
+        <a:font script="Uigh" typeface="Microsoft Uighur"/>
+        <a:font script="Geor" typeface="Sylfaen"/>
+        <a:font script="Armn" typeface="Arial"/>
+        <a:font script="Bugi" typeface="Leelawadee UI"/>
+        <a:font script="Bopo" typeface="Microsoft JhengHei"/>
+        <a:font script="Java" typeface="Javanese Text"/>
+        <a:font script="Lisu" typeface="Segoe UI"/>
+        <a:font script="Mymr" typeface="Myanmar Text"/>
+        <a:font script="Nkoo" typeface="Ebrima"/>
+        <a:font script="Olck" typeface="Nirmala UI"/>
+        <a:font script="Osma" typeface="Ebrima"/>
+        <a:font script="Phag" typeface="Phagspa"/>
+        <a:font script="Syrn" typeface="Estrangelo Edessa"/>
+        <a:font script="Syrj" typeface="Estrangelo Edessa"/>
+        <a:font script="Syre" typeface="Estrangelo Edessa"/>
+        <a:font script="Sora" typeface="Nirmala UI"/>
+        <a:font script="Tale" typeface="Microsoft Tai Le"/>
+        <a:font script="Talu" typeface="Microsoft New Tai Lue"/>
+        <a:font script="Tfng" typeface="Ebrima"/>
+      </a:minorFont>
+    </a:fontScheme>
+    <a:fmtScheme name="Office">
+      <a:fillStyleLst>
+        <a:solidFill>
+          <a:schemeClr val="phClr"/>
+        </a:solidFill>
+        <a:gradFill rotWithShape="true">
+          <a:gsLst>
+            <a:gs pos="0">
+              <a:schemeClr val="phClr">
+                <a:lumMod val="110000"/>
+                <a:satMod val="105000"/>
+                <a:tint val="67000"/>
+              </a:schemeClr>
+            </a:gs>
+            <a:gs pos="50000">
+              <a:schemeClr val="phClr">
+                <a:lumMod val="105000"/>
+                <a:satMod val="103000"/>
+                <a:tint val="73000"/>
+              </a:schemeClr>
+            </a:gs>
+            <a:gs pos="100000">
+              <a:schemeClr val="phClr">
+                <a:lumMod val="105000"/>
+                <a:satMod val="109000"/>
+                <a:tint val="81000"/>
+              </a:schemeClr>
+            </a:gs>
+          </a:gsLst>
+          <a:lin ang="5400000" scaled="false"/>
+        </a:gradFill>
+        <a:gradFill rotWithShape="true">
+          <a:gsLst>
+            <a:gs pos="0">
+              <a:schemeClr val="phClr">
+                <a:satMod val="103000"/>
+                <a:lumMod val="102000"/>
+                <a:tint val="94000"/>
+              </a:schemeClr>
+            </a:gs>
+            <a:gs pos="50000">
+              <a:schemeClr val="phClr">
+                <a:satMod val="110000"/>
+                <a:lumMod val="100000"/>
+                <a:shade val="100000"/>
+              </a:schemeClr>
+            </a:gs>
+            <a:gs pos="100000">
+              <a:schemeClr val="phClr">
+                <a:lumMod val="99000"/>
+                <a:satMod val="120000"/>
+                <a:shade val="78000"/>
+              </a:schemeClr>
+            </a:gs>
+          </a:gsLst>
+          <a:lin ang="5400000" scaled="false"/>
+        </a:gradFill>
+      </a:fillStyleLst>
+      <a:lnStyleLst>
+        <a:ln w="6350" cap="flat" cmpd="sng" algn="ctr">
+          <a:solidFill>
+            <a:schemeClr val="phClr"/>
+          </a:solidFill>
+          <a:prstDash val="solid"/>
+          <a:miter lim="800000"/>
+        </a:ln>
+        <a:ln w="12700" cap="flat" cmpd="sng" algn="ctr">
+          <a:solidFill>
+            <a:schemeClr val="phClr"/>
+          </a:solidFill>
+          <a:prstDash val="solid"/>
+          <a:miter lim="800000"/>
+        </a:ln>
+        <a:ln w="19050" cap="flat" cmpd="sng" algn="ctr">
+          <a:solidFill>
+            <a:schemeClr val="phClr"/>
+          </a:solidFill>
+          <a:prstDash val="solid"/>
+          <a:miter lim="800000"/>
+        </a:ln>
+      </a:lnStyleLst>
+      <a:effectStyleLst>
+        <a:effectStyle>
+          <a:effectLst/>
+        </a:effectStyle>
+        <a:effectStyle>
+          <a:effectLst/>
+        </a:effectStyle>
+        <a:effectStyle>
+          <a:effectLst>
+            <a:outerShdw blurRad="57150" dist="19050" dir="5400000" algn="ctr" rotWithShape="false">
+              <a:srgbClr val="000000">
+                <a:alpha val="63000"/>
+              </a:srgbClr>
+            </a:outerShdw>
+          </a:effectLst>
+        </a:effectStyle>
+      </a:effectStyleLst>
+      <a:bgFillStyleLst>
+        <a:solidFill>
+          <a:schemeClr val="phClr"/>
+        </a:solidFill>
+        <a:solidFill>
+          <a:schemeClr val="phClr">
+            <a:tint val="95000"/>
+            <a:satMod val="170000"/>
+          </a:schemeClr>
+        </a:solidFill>
+        <a:gradFill rotWithShape="true">
+          <a:gsLst>
+            <a:gs pos="0">
+              <a:schemeClr val="phClr">
+                <a:tint val="93000"/>
+                <a:satMod val="150000"/>
+                <a:shade val="98000"/>
+                <a:lumMod val="102000"/>
+              </a:schemeClr>
+            </a:gs>
+            <a:gs pos="50000">
+              <a:schemeClr val="phClr">
+                <a:tint val="98000"/>
+                <a:satMod val="130000"/>
+                <a:shade val="90000"/>
+                <a:lumMod val="103000"/>
+              </a:schemeClr>
+            </a:gs>
+            <a:gs pos="100000">
+              <a:schemeClr val="phClr">
+                <a:shade val="63000"/>
+                <a:satMod val="120000"/>
+              </a:schemeClr>
+            </a:gs>
+          </a:gsLst>
+          <a:lin ang="5400000" scaled="false"/>
+        </a:gradFill>
+      </a:bgFillStyleLst>
+    </a:fmtScheme>
+  </a:themeElements>
+  <a:objectDefaults/>
+  <a:extraClrSchemeLst/>
+</a:theme>
 </file>
</xml_diff>